<commit_message>
dodan finalni plan projekta
</commit_message>
<xml_diff>
--- a/documentation/plan_projekta.docx
+++ b/documentation/plan_projekta.docx
@@ -1,6 +1,6 @@
 
 <file path=word/document.xml><?xml version="1.0" encoding="utf-8"?>
-<w:document xmlns:wpc="http://schemas.microsoft.com/office/word/2010/wordprocessingCanvas" xmlns:cx="http://schemas.microsoft.com/office/drawing/2014/chartex" xmlns:cx1="http://schemas.microsoft.com/office/drawing/2015/9/8/chartex" xmlns:cx2="http://schemas.microsoft.com/office/drawing/2015/10/21/chartex" xmlns:cx3="http://schemas.microsoft.com/office/drawing/2016/5/9/chartex" xmlns:cx4="http://schemas.microsoft.com/office/drawing/2016/5/10/chartex" xmlns:cx5="http://schemas.microsoft.com/office/drawing/2016/5/11/chartex" xmlns:cx6="http://schemas.microsoft.com/office/drawing/2016/5/12/chartex" xmlns:cx7="http://schemas.microsoft.com/office/drawing/2016/5/13/chartex" xmlns:cx8="http://schemas.microsoft.com/office/drawing/2016/5/14/chartex" xmlns:mc="http://schemas.openxmlformats.org/markup-compatibility/2006" xmlns:aink="http://schemas.microsoft.com/office/drawing/2016/ink" xmlns:am3d="http://schemas.microsoft.com/office/drawing/2017/model3d" xmlns:o="urn:schemas-microsoft-com:office:office" xmlns:oel="http://schemas.microsoft.com/office/2019/extlst" xmlns:r="http://schemas.openxmlformats.org/officeDocument/2006/relationships" xmlns:m="http://schemas.openxmlformats.org/officeDocument/2006/math" xmlns:v="urn:schemas-microsoft-com:vml" xmlns:wp14="http://schemas.microsoft.com/office/word/2010/wordprocessingDrawing" xmlns:wp="http://schemas.openxmlformats.org/drawingml/2006/wordprocessingDrawing" xmlns:w10="urn:schemas-microsoft-com:office:word" xmlns:w="http://schemas.openxmlformats.org/wordprocessingml/2006/main" xmlns:w14="http://schemas.microsoft.com/office/word/2010/wordml" xmlns:w15="http://schemas.microsoft.com/office/word/2012/wordml" xmlns:w16cex="http://schemas.microsoft.com/office/word/2018/wordml/cex" xmlns:w16cid="http://schemas.microsoft.com/office/word/2016/wordml/cid" xmlns:w16="http://schemas.microsoft.com/office/word/2018/wordml" xmlns:w16du="http://schemas.microsoft.com/office/word/2023/wordml/word16du" xmlns:w16sdtdh="http://schemas.microsoft.com/office/word/2020/wordml/sdtdatahash" xmlns:w16se="http://schemas.microsoft.com/office/word/2015/wordml/symex" xmlns:wpg="http://schemas.microsoft.com/office/word/2010/wordprocessingGroup" xmlns:wpi="http://schemas.microsoft.com/office/word/2010/wordprocessingInk" xmlns:wne="http://schemas.microsoft.com/office/word/2006/wordml" xmlns:wps="http://schemas.microsoft.com/office/word/2010/wordprocessingShape" mc:Ignorable="w14 w15 w16se w16cid w16 w16cex w16sdtdh w16du wp14">
+<w:document xmlns:wpc="http://schemas.microsoft.com/office/word/2010/wordprocessingCanvas" xmlns:cx="http://schemas.microsoft.com/office/drawing/2014/chartex" xmlns:cx1="http://schemas.microsoft.com/office/drawing/2015/9/8/chartex" xmlns:cx2="http://schemas.microsoft.com/office/drawing/2015/10/21/chartex" xmlns:cx3="http://schemas.microsoft.com/office/drawing/2016/5/9/chartex" xmlns:cx4="http://schemas.microsoft.com/office/drawing/2016/5/10/chartex" xmlns:cx5="http://schemas.microsoft.com/office/drawing/2016/5/11/chartex" xmlns:cx6="http://schemas.microsoft.com/office/drawing/2016/5/12/chartex" xmlns:cx7="http://schemas.microsoft.com/office/drawing/2016/5/13/chartex" xmlns:cx8="http://schemas.microsoft.com/office/drawing/2016/5/14/chartex" xmlns:mc="http://schemas.openxmlformats.org/markup-compatibility/2006" xmlns:aink="http://schemas.microsoft.com/office/drawing/2016/ink" xmlns:am3d="http://schemas.microsoft.com/office/drawing/2017/model3d" xmlns:o="urn:schemas-microsoft-com:office:office" xmlns:oel="http://schemas.microsoft.com/office/2019/extlst" xmlns:r="http://schemas.openxmlformats.org/officeDocument/2006/relationships" xmlns:m="http://schemas.openxmlformats.org/officeDocument/2006/math" xmlns:v="urn:schemas-microsoft-com:vml" xmlns:wp14="http://schemas.microsoft.com/office/word/2010/wordprocessingDrawing" xmlns:wp="http://schemas.openxmlformats.org/drawingml/2006/wordprocessingDrawing" xmlns:w10="urn:schemas-microsoft-com:office:word" xmlns:w="http://schemas.openxmlformats.org/wordprocessingml/2006/main" xmlns:w14="http://schemas.microsoft.com/office/word/2010/wordml" xmlns:w15="http://schemas.microsoft.com/office/word/2012/wordml" xmlns:w16cex="http://schemas.microsoft.com/office/word/2018/wordml/cex" xmlns:w16cid="http://schemas.microsoft.com/office/word/2016/wordml/cid" xmlns:w16="http://schemas.microsoft.com/office/word/2018/wordml" xmlns:w16du="http://schemas.microsoft.com/office/word/2023/wordml/word16du" xmlns:w16sdtdh="http://schemas.microsoft.com/office/word/2020/wordml/sdtdatahash" xmlns:w16sdtfl="http://schemas.microsoft.com/office/word/2024/wordml/sdtformatlock" xmlns:w16se="http://schemas.microsoft.com/office/word/2015/wordml/symex" xmlns:wpg="http://schemas.microsoft.com/office/word/2010/wordprocessingGroup" xmlns:wpi="http://schemas.microsoft.com/office/word/2010/wordprocessingInk" xmlns:wne="http://schemas.microsoft.com/office/word/2006/wordml" xmlns:wps="http://schemas.microsoft.com/office/word/2010/wordprocessingShape" mc:Ignorable="w14 w15 w16se w16cid w16 w16cex w16sdtdh w16sdtfl w16du wp14">
   <w:body>
     <w:p>
       <w:pPr>
@@ -101,7 +101,21 @@
           <w:sz w:val="28"/>
           <w:lang w:val="hr-HR"/>
         </w:rPr>
-        <w:t xml:space="preserve"> 1.0</w:t>
+        <w:t xml:space="preserve"> </w:t>
+      </w:r>
+      <w:r>
+        <w:rPr>
+          <w:sz w:val="28"/>
+          <w:lang w:val="hr-HR"/>
+        </w:rPr>
+        <w:t>2</w:t>
+      </w:r>
+      <w:r>
+        <w:rPr>
+          <w:sz w:val="28"/>
+          <w:lang w:val="hr-HR"/>
+        </w:rPr>
+        <w:t>.0</w:t>
       </w:r>
     </w:p>
     <w:p>
@@ -1351,170 +1365,6 @@
     </w:p>
     <w:p>
       <w:pPr>
-        <w:pStyle w:val="InfoBlue"/>
-        <w:rPr>
-          <w:lang w:val="hr-HR"/>
-        </w:rPr>
-      </w:pPr>
-    </w:p>
-    <w:p>
-      <w:pPr>
-        <w:pStyle w:val="InfoBlue"/>
-        <w:rPr>
-          <w:lang w:val="hr-HR"/>
-        </w:rPr>
-      </w:pPr>
-      <w:r>
-        <w:rPr>
-          <w:lang w:val="hr-HR"/>
-        </w:rPr>
-        <w:t>Na koji način koristiti predložak?</w:t>
-      </w:r>
-    </w:p>
-    <w:p>
-      <w:pPr>
-        <w:pStyle w:val="InfoBlue"/>
-        <w:rPr>
-          <w:lang w:val="hr-HR"/>
-        </w:rPr>
-      </w:pPr>
-    </w:p>
-    <w:p>
-      <w:pPr>
-        <w:pStyle w:val="InfoBlue"/>
-        <w:rPr>
-          <w:lang w:val="hr-HR"/>
-        </w:rPr>
-      </w:pPr>
-      <w:r>
-        <w:rPr>
-          <w:lang w:val="hr-HR"/>
-        </w:rPr>
-        <w:t xml:space="preserve">Tekst pisan u </w:t>
-      </w:r>
-      <w:proofErr w:type="spellStart"/>
-      <w:r>
-        <w:rPr>
-          <w:lang w:val="hr-HR"/>
-        </w:rPr>
-        <w:t>italic</w:t>
-      </w:r>
-      <w:proofErr w:type="spellEnd"/>
-      <w:r>
-        <w:rPr>
-          <w:lang w:val="hr-HR"/>
-        </w:rPr>
-        <w:t xml:space="preserve"> formi </w:t>
-      </w:r>
-      <w:r>
-        <w:rPr>
-          <w:lang w:val="hr-HR"/>
-        </w:rPr>
-        <w:t>opisuje</w:t>
-      </w:r>
-      <w:r>
-        <w:rPr>
-          <w:lang w:val="hr-HR"/>
-        </w:rPr>
-        <w:t xml:space="preserve"> koje informacije je potrebno uključiti u</w:t>
-      </w:r>
-      <w:r>
-        <w:rPr>
-          <w:lang w:val="hr-HR"/>
-        </w:rPr>
-        <w:t xml:space="preserve"> pojedino poglavlje Prijedloga.</w:t>
-      </w:r>
-    </w:p>
-    <w:p>
-      <w:pPr>
-        <w:pStyle w:val="InfoBlue"/>
-        <w:rPr>
-          <w:lang w:val="hr-HR"/>
-        </w:rPr>
-      </w:pPr>
-      <w:r>
-        <w:rPr>
-          <w:lang w:val="hr-HR"/>
-        </w:rPr>
-        <w:t>Za upis vlastitog teksta</w:t>
-      </w:r>
-      <w:r>
-        <w:rPr>
-          <w:lang w:val="hr-HR"/>
-        </w:rPr>
-        <w:t xml:space="preserve">, potrebno je </w:t>
-      </w:r>
-      <w:r>
-        <w:rPr>
-          <w:lang w:val="hr-HR"/>
-        </w:rPr>
-        <w:t>pri</w:t>
-      </w:r>
-      <w:r>
-        <w:rPr>
-          <w:lang w:val="hr-HR"/>
-        </w:rPr>
-        <w:t xml:space="preserve">tisnuti &lt;ENTER&gt; nakon </w:t>
-      </w:r>
-      <w:proofErr w:type="spellStart"/>
-      <w:r>
-        <w:rPr>
-          <w:lang w:val="hr-HR"/>
-        </w:rPr>
-        <w:t>italic</w:t>
-      </w:r>
-      <w:proofErr w:type="spellEnd"/>
-      <w:r>
-        <w:rPr>
-          <w:lang w:val="hr-HR"/>
-        </w:rPr>
-        <w:t xml:space="preserve"> teksta. </w:t>
-      </w:r>
-    </w:p>
-    <w:p>
-      <w:pPr>
-        <w:pStyle w:val="InfoBlue"/>
-        <w:rPr>
-          <w:lang w:val="hr-HR"/>
-        </w:rPr>
-      </w:pPr>
-      <w:r>
-        <w:rPr>
-          <w:lang w:val="hr-HR"/>
-        </w:rPr>
-        <w:t>Tekst upisan u &lt;trokutastim zagradama&gt; treba zamijeniti s onim što se navodi</w:t>
-      </w:r>
-      <w:r>
-        <w:rPr>
-          <w:lang w:val="hr-HR"/>
-        </w:rPr>
-        <w:t>.</w:t>
-      </w:r>
-    </w:p>
-    <w:p>
-      <w:pPr>
-        <w:pStyle w:val="InfoBlue"/>
-        <w:rPr>
-          <w:lang w:val="hr-HR"/>
-        </w:rPr>
-      </w:pPr>
-    </w:p>
-    <w:p>
-      <w:pPr>
-        <w:pStyle w:val="InfoBlue"/>
-        <w:rPr>
-          <w:lang w:val="hr-HR"/>
-        </w:rPr>
-      </w:pPr>
-      <w:r>
-        <w:rPr>
-          <w:lang w:val="hr-HR"/>
-        </w:rPr>
-        <w:t>Svi članovi tima trebaju pročitati plan i suglasiti se s njime, a to potvrđuju svojim potpisom na kraju dokumenta.</w:t>
-      </w:r>
-    </w:p>
-    <w:p>
-      <w:pPr>
         <w:pStyle w:val="Tijeloteksta"/>
         <w:rPr>
           <w:lang w:val="hr-HR"/>
@@ -1532,6 +1382,10 @@
     <w:p>
       <w:pPr>
         <w:pStyle w:val="Naslov1"/>
+        <w:numPr>
+          <w:ilvl w:val="0"/>
+          <w:numId w:val="0"/>
+        </w:numPr>
         <w:rPr>
           <w:lang w:val="hr-HR"/>
         </w:rPr>
@@ -1554,32 +1408,6 @@
     </w:p>
     <w:p>
       <w:pPr>
-        <w:pStyle w:val="InfoBlue"/>
-        <w:rPr>
-          <w:lang w:val="hr-HR"/>
-        </w:rPr>
-      </w:pPr>
-      <w:r>
-        <w:rPr>
-          <w:lang w:val="hr-HR"/>
-        </w:rPr>
-        <w:t>[</w:t>
-      </w:r>
-      <w:r>
-        <w:rPr>
-          <w:lang w:val="hr-HR"/>
-        </w:rPr>
-        <w:t>Navesti puni naziv projekta iz kojeg će biti vidljiva problematika/tematika kojom se projekt bavi</w:t>
-      </w:r>
-      <w:r>
-        <w:rPr>
-          <w:lang w:val="hr-HR"/>
-        </w:rPr>
-        <w:t>.]</w:t>
-      </w:r>
-    </w:p>
-    <w:p>
-      <w:pPr>
         <w:pStyle w:val="Tijeloteksta"/>
         <w:rPr>
           <w:lang w:val="hr-HR"/>
@@ -1610,32 +1438,6 @@
     </w:p>
     <w:p>
       <w:pPr>
-        <w:pStyle w:val="InfoBlue"/>
-        <w:rPr>
-          <w:lang w:val="hr-HR"/>
-        </w:rPr>
-      </w:pPr>
-      <w:r>
-        <w:rPr>
-          <w:lang w:val="hr-HR"/>
-        </w:rPr>
-        <w:t>[</w:t>
-      </w:r>
-      <w:r>
-        <w:rPr>
-          <w:lang w:val="hr-HR"/>
-        </w:rPr>
-        <w:t>Navesti skraćeni naziv projekta, ako je definiran.</w:t>
-      </w:r>
-      <w:r>
-        <w:rPr>
-          <w:lang w:val="hr-HR"/>
-        </w:rPr>
-        <w:t>]</w:t>
-      </w:r>
-    </w:p>
-    <w:p>
-      <w:pPr>
         <w:pStyle w:val="Tijeloteksta"/>
         <w:rPr>
           <w:lang w:val="hr-HR"/>
@@ -1672,32 +1474,6 @@
     </w:p>
     <w:p>
       <w:pPr>
-        <w:pStyle w:val="InfoBlue"/>
-        <w:rPr>
-          <w:lang w:val="hr-HR"/>
-        </w:rPr>
-      </w:pPr>
-      <w:r>
-        <w:rPr>
-          <w:lang w:val="hr-HR"/>
-        </w:rPr>
-        <w:t>[Objasniti problem, odnosno temu projekta</w:t>
-      </w:r>
-      <w:r>
-        <w:rPr>
-          <w:lang w:val="hr-HR"/>
-        </w:rPr>
-        <w:t>, o</w:t>
-      </w:r>
-      <w:r>
-        <w:rPr>
-          <w:lang w:val="hr-HR"/>
-        </w:rPr>
-        <w:t>bjasniti ukratko tip, uvjete i kontekst projekta.]</w:t>
-      </w:r>
-    </w:p>
-    <w:p>
-      <w:pPr>
         <w:pStyle w:val="Tijeloteksta"/>
         <w:rPr>
           <w:lang w:val="hr-HR"/>
@@ -1713,49 +1489,7 @@
         <w:rPr>
           <w:lang w:val="hr-HR"/>
         </w:rPr>
-        <w:t xml:space="preserve">ki korištenjem </w:t>
-      </w:r>
-      <w:proofErr w:type="spellStart"/>
-      <w:r>
-        <w:rPr>
-          <w:lang w:val="hr-HR"/>
-        </w:rPr>
-        <w:t>prediktivnih</w:t>
-      </w:r>
-      <w:proofErr w:type="spellEnd"/>
-      <w:r>
-        <w:rPr>
-          <w:lang w:val="hr-HR"/>
-        </w:rPr>
-        <w:t xml:space="preserve"> modela. Ovaj je problem </w:t>
-      </w:r>
-      <w:proofErr w:type="spellStart"/>
-      <w:r>
-        <w:rPr>
-          <w:lang w:val="hr-HR"/>
-        </w:rPr>
-        <w:t>potpodručje</w:t>
-      </w:r>
-      <w:proofErr w:type="spellEnd"/>
-      <w:r>
-        <w:rPr>
-          <w:lang w:val="hr-HR"/>
-        </w:rPr>
-        <w:t xml:space="preserve"> </w:t>
-      </w:r>
-      <w:proofErr w:type="spellStart"/>
-      <w:r>
-        <w:rPr>
-          <w:lang w:val="hr-HR"/>
-        </w:rPr>
-        <w:t>kemoinformatike</w:t>
-      </w:r>
-      <w:proofErr w:type="spellEnd"/>
-      <w:r>
-        <w:rPr>
-          <w:lang w:val="hr-HR"/>
-        </w:rPr>
-        <w:t xml:space="preserve">, koja spaja kemiju i računalnu znanost, te nastoji pretvoriti </w:t>
+        <w:t xml:space="preserve">ki korištenjem prediktivnih modela. Ovaj je problem potpodručje kemoinformatike, koja spaja kemiju i računalnu znanost, te nastoji pretvoriti </w:t>
       </w:r>
       <w:r>
         <w:rPr>
@@ -1767,27 +1501,13 @@
         <w:rPr>
           <w:lang w:val="hr-HR"/>
         </w:rPr>
-        <w:t xml:space="preserve">e informacije. </w:t>
-      </w:r>
-      <w:proofErr w:type="spellStart"/>
-      <w:r>
-        <w:rPr>
-          <w:lang w:val="hr-HR"/>
-        </w:rPr>
-        <w:t>K</w:t>
-      </w:r>
-      <w:r>
-        <w:rPr>
-          <w:lang w:val="hr-HR"/>
-        </w:rPr>
-        <w:t>emoinformatika</w:t>
-      </w:r>
-      <w:proofErr w:type="spellEnd"/>
-      <w:r>
-        <w:rPr>
-          <w:lang w:val="hr-HR"/>
-        </w:rPr>
-        <w:t xml:space="preserve"> je ključn</w:t>
+        <w:t>e informacije. K</w:t>
+      </w:r>
+      <w:r>
+        <w:rPr>
+          <w:lang w:val="hr-HR"/>
+        </w:rPr>
+        <w:t>emoinformatika je ključn</w:t>
       </w:r>
       <w:r>
         <w:rPr>
@@ -1831,14 +1551,7 @@
         <w:rPr>
           <w:lang w:val="hr-HR"/>
         </w:rPr>
-        <w:t xml:space="preserve"> može povećati točnost predikcija svojstava poput topljivosti, biološke aktivnosti ili toksičnosti, identificirajući suptilne obrasce u molekularnoj strukturi. Ove su predikcije posebno korisne u kontekstima gdje su biološka ili kemijska testiranja nepraktična ili skupa, jer modeli strojnog učenja, trenirani na velikim skupovima podataka, mogu približno zamijeniti ove eksperimente uz mnogo manje resursa. Ovaj pristup također </w:t>
-      </w:r>
-      <w:proofErr w:type="spellStart"/>
-      <w:r>
-        <w:rPr>
-          <w:lang w:val="hr-HR"/>
-        </w:rPr>
-        <w:t>omogućujuć</w:t>
+        <w:t xml:space="preserve"> može povećati točnost predikcija svojstava poput topljivosti, biološke aktivnosti ili toksičnosti, identificirajući suptilne obrasce u molekularnoj strukturi. Ove su predikcije posebno korisne u kontekstima gdje su biološka ili kemijska testiranja nepraktična ili skupa, jer modeli strojnog učenja, trenirani na velikim skupovima podataka, mogu približno zamijeniti ove eksperimente uz mnogo manje resursa. Ovaj pristup također omogućujuć</w:t>
       </w:r>
       <w:r>
         <w:rPr>
@@ -1846,54 +1559,11 @@
         </w:rPr>
         <w:t>uje</w:t>
       </w:r>
-      <w:proofErr w:type="spellEnd"/>
-      <w:r>
-        <w:rPr>
-          <w:lang w:val="hr-HR"/>
-        </w:rPr>
-        <w:t xml:space="preserve"> brzo filtriranje i </w:t>
-      </w:r>
-      <w:proofErr w:type="spellStart"/>
-      <w:r>
-        <w:rPr>
-          <w:lang w:val="hr-HR"/>
-        </w:rPr>
-        <w:t>prioritizaciju</w:t>
-      </w:r>
-      <w:proofErr w:type="spellEnd"/>
-      <w:r>
-        <w:rPr>
-          <w:lang w:val="hr-HR"/>
-        </w:rPr>
-        <w:t xml:space="preserve"> spojeva koji zadovoljavaju specifične kriterije, čime se olakšava brža i preciznija eksperimentalna validacija. Kroz takve </w:t>
-      </w:r>
-      <w:proofErr w:type="spellStart"/>
-      <w:r>
-        <w:rPr>
-          <w:lang w:val="hr-HR"/>
-        </w:rPr>
-        <w:t>prediktivne</w:t>
-      </w:r>
-      <w:proofErr w:type="spellEnd"/>
-      <w:r>
-        <w:rPr>
-          <w:lang w:val="hr-HR"/>
-        </w:rPr>
-        <w:t xml:space="preserve"> modele, </w:t>
-      </w:r>
-      <w:proofErr w:type="spellStart"/>
-      <w:r>
-        <w:rPr>
-          <w:lang w:val="hr-HR"/>
-        </w:rPr>
-        <w:t>kemoinformatika</w:t>
-      </w:r>
-      <w:proofErr w:type="spellEnd"/>
-      <w:r>
-        <w:rPr>
-          <w:lang w:val="hr-HR"/>
-        </w:rPr>
-        <w:t xml:space="preserve"> dodatno minimizira eksperimentalne zahtjeve i povećava preciznost u dizajnu i otkrivanju molekula​</w:t>
+      <w:r>
+        <w:rPr>
+          <w:lang w:val="hr-HR"/>
+        </w:rPr>
+        <w:t xml:space="preserve"> brzo filtriranje i prioritizaciju spojeva koji zadovoljavaju specifične kriterije, čime se olakšava brža i preciznija eksperimentalna validacija. Kroz takve prediktivne modele, kemoinformatika dodatno minimizira eksperimentalne zahtjeve i povećava preciznost u dizajnu i otkrivanju molekula​</w:t>
       </w:r>
       <w:r>
         <w:rPr>
@@ -1926,74 +1596,6 @@
     </w:p>
     <w:p>
       <w:pPr>
-        <w:pStyle w:val="InfoBlue"/>
-        <w:rPr>
-          <w:lang w:val="hr-HR"/>
-        </w:rPr>
-      </w:pPr>
-      <w:r>
-        <w:rPr>
-          <w:lang w:val="hr-HR"/>
-        </w:rPr>
-        <w:t>[</w:t>
-      </w:r>
-      <w:r>
-        <w:rPr>
-          <w:lang w:val="hr-HR"/>
-        </w:rPr>
-        <w:t>Navesti predviđeni cilj ili ciljeve projekta</w:t>
-      </w:r>
-      <w:r>
-        <w:rPr>
-          <w:lang w:val="hr-HR"/>
-        </w:rPr>
-        <w:t>. Definiranje ciljeva</w:t>
-      </w:r>
-      <w:r>
-        <w:rPr>
-          <w:lang w:val="hr-HR"/>
-        </w:rPr>
-        <w:t xml:space="preserve"> </w:t>
-      </w:r>
-      <w:r>
-        <w:rPr>
-          <w:lang w:val="hr-HR"/>
-        </w:rPr>
-        <w:t>omoguću</w:t>
-      </w:r>
-      <w:r>
-        <w:rPr>
-          <w:lang w:val="hr-HR"/>
-        </w:rPr>
-        <w:t>j</w:t>
-      </w:r>
-      <w:r>
-        <w:rPr>
-          <w:lang w:val="hr-HR"/>
-        </w:rPr>
-        <w:t>e</w:t>
-      </w:r>
-      <w:r>
-        <w:rPr>
-          <w:lang w:val="hr-HR"/>
-        </w:rPr>
-        <w:t xml:space="preserve"> određivanje pravca u kojem će se kretati izvođenje projekta.</w:t>
-      </w:r>
-      <w:r>
-        <w:rPr>
-          <w:lang w:val="hr-HR"/>
-        </w:rPr>
-        <w:t xml:space="preserve"> Navesti predviđeno trajanje projekta.</w:t>
-      </w:r>
-      <w:r>
-        <w:rPr>
-          <w:lang w:val="hr-HR"/>
-        </w:rPr>
-        <w:t>]</w:t>
-      </w:r>
-    </w:p>
-    <w:p>
-      <w:pPr>
         <w:pStyle w:val="Tijeloteksta"/>
         <w:rPr>
           <w:lang w:val="hr-HR"/>
@@ -2003,35 +1605,7 @@
         <w:rPr>
           <w:lang w:val="hr-HR"/>
         </w:rPr>
-        <w:t xml:space="preserve">Cilj projekta je primijeniti tehnike </w:t>
-      </w:r>
-      <w:proofErr w:type="spellStart"/>
-      <w:r>
-        <w:rPr>
-          <w:lang w:val="hr-HR"/>
-        </w:rPr>
-        <w:t>prediktivne</w:t>
-      </w:r>
-      <w:proofErr w:type="spellEnd"/>
-      <w:r>
-        <w:rPr>
-          <w:lang w:val="hr-HR"/>
-        </w:rPr>
-        <w:t xml:space="preserve"> analize u području </w:t>
-      </w:r>
-      <w:proofErr w:type="spellStart"/>
-      <w:r>
-        <w:rPr>
-          <w:lang w:val="hr-HR"/>
-        </w:rPr>
-        <w:t>kemoinformatike</w:t>
-      </w:r>
-      <w:proofErr w:type="spellEnd"/>
-      <w:r>
-        <w:rPr>
-          <w:lang w:val="hr-HR"/>
-        </w:rPr>
-        <w:t xml:space="preserve"> </w:t>
+        <w:t xml:space="preserve">Cilj projekta je primijeniti tehnike prediktivne analize u području kemoinformatike </w:t>
       </w:r>
       <w:r>
         <w:rPr>
@@ -2136,32 +1710,6 @@
     </w:p>
     <w:p>
       <w:pPr>
-        <w:pStyle w:val="InfoBlue"/>
-        <w:rPr>
-          <w:lang w:val="hr-HR"/>
-        </w:rPr>
-      </w:pPr>
-      <w:r>
-        <w:rPr>
-          <w:lang w:val="hr-HR"/>
-        </w:rPr>
-        <w:t>&lt;Ime</w:t>
-      </w:r>
-      <w:r>
-        <w:rPr>
-          <w:lang w:val="hr-HR"/>
-        </w:rPr>
-        <w:t xml:space="preserve"> i prezime studenta</w:t>
-      </w:r>
-      <w:r>
-        <w:rPr>
-          <w:lang w:val="hr-HR"/>
-        </w:rPr>
-        <w:t>&gt;</w:t>
-      </w:r>
-    </w:p>
-    <w:p>
-      <w:pPr>
         <w:pStyle w:val="Tijeloteksta"/>
         <w:rPr>
           <w:lang w:val="hr-HR"/>
@@ -2171,16 +1719,8 @@
         <w:rPr>
           <w:lang w:val="hr-HR"/>
         </w:rPr>
-        <w:t xml:space="preserve">Ana Francesca </w:t>
-      </w:r>
-      <w:proofErr w:type="spellStart"/>
-      <w:r>
-        <w:rPr>
-          <w:lang w:val="hr-HR"/>
-        </w:rPr>
-        <w:t>Stama</w:t>
-      </w:r>
-      <w:proofErr w:type="spellEnd"/>
+        <w:t>Ana Francesca Stama</w:t>
+      </w:r>
     </w:p>
     <w:p>
       <w:pPr>
@@ -2203,38 +1743,6 @@
         <w:t>Rezultat(i)</w:t>
       </w:r>
       <w:bookmarkEnd w:id="5"/>
-    </w:p>
-    <w:p>
-      <w:pPr>
-        <w:pStyle w:val="InfoBlue"/>
-        <w:rPr>
-          <w:lang w:val="hr-HR"/>
-        </w:rPr>
-      </w:pPr>
-      <w:r>
-        <w:rPr>
-          <w:lang w:val="hr-HR"/>
-        </w:rPr>
-        <w:t>[Navesti š</w:t>
-      </w:r>
-      <w:r>
-        <w:rPr>
-          <w:lang w:val="hr-HR"/>
-        </w:rPr>
-        <w:t>to će se isporučiti na kraju projekta</w:t>
-      </w:r>
-      <w:r>
-        <w:rPr>
-          <w:lang w:val="hr-HR"/>
-        </w:rPr>
-        <w:t>, voditi računa da osim rezultata u vidu nekog proizvoda ovdje treba navesti i svu dokumentaciju.</w:t>
-      </w:r>
-      <w:r>
-        <w:rPr>
-          <w:lang w:val="hr-HR"/>
-        </w:rPr>
-        <w:t>]</w:t>
-      </w:r>
     </w:p>
     <w:p>
       <w:pPr>
@@ -2269,25 +1777,17 @@
     </w:p>
     <w:p>
       <w:pPr>
-        <w:pStyle w:val="InfoBlue"/>
-        <w:rPr>
-          <w:lang w:val="hr-HR"/>
-        </w:rPr>
-      </w:pPr>
-      <w:r>
-        <w:rPr>
-          <w:lang w:val="hr-HR"/>
-        </w:rPr>
-        <w:t>[Navesti projekte koji su povezani s dotičnim projektom.]</w:t>
-      </w:r>
-    </w:p>
-    <w:p>
-      <w:pPr>
         <w:pStyle w:val="Tijeloteksta"/>
         <w:rPr>
           <w:lang w:val="hr-HR"/>
         </w:rPr>
       </w:pPr>
+      <w:r>
+        <w:rPr>
+          <w:lang w:val="hr-HR"/>
+        </w:rPr>
+        <w:t>-</w:t>
+      </w:r>
     </w:p>
     <w:p>
       <w:pPr>
@@ -2301,37 +1801,10 @@
         <w:rPr>
           <w:lang w:val="hr-HR"/>
         </w:rPr>
-        <w:lastRenderedPageBreak/>
         <w:t>Resursi</w:t>
       </w:r>
       <w:bookmarkEnd w:id="7"/>
       <w:bookmarkEnd w:id="8"/>
-    </w:p>
-    <w:p>
-      <w:pPr>
-        <w:pStyle w:val="InfoBlue"/>
-        <w:rPr>
-          <w:lang w:val="hr-HR"/>
-        </w:rPr>
-      </w:pPr>
-      <w:r>
-        <w:rPr>
-          <w:lang w:val="hr-HR"/>
-        </w:rPr>
-        <w:t>[Navesti ljudske i ostale resurse potrebne za uspješno dovršenje projekta.</w:t>
-      </w:r>
-      <w:r>
-        <w:rPr>
-          <w:lang w:val="hr-HR"/>
-        </w:rPr>
-        <w:t xml:space="preserve"> Popuniti tablicu raspoloživih članova tima s podacima važnim za projekt. Mogu se navesti znanja i vještine člana koje mogu biti od koristi za projekt, na primjer znanja Java-e, XML-a, iskustvo u radu s MS Projectom, sudjelovanje u sličnim projektima ili bilo kakva korisna informacija. Ako projekt koristi i druge resurse napraviti posebnu tablicu za njih. U kolonu Napomene treba upisati sve termine kad dotični član tima neće biti raspoloživ za rad na projektu (putovanja, odmori, odsustva).</w:t>
-      </w:r>
-      <w:r>
-        <w:rPr>
-          <w:lang w:val="hr-HR"/>
-        </w:rPr>
-        <w:t>]</w:t>
-      </w:r>
     </w:p>
     <w:p>
       <w:pPr>
@@ -2496,16 +1969,8 @@
               <w:rPr>
                 <w:lang w:val="hr-HR"/>
               </w:rPr>
-              <w:t xml:space="preserve">Ana Francesca </w:t>
+              <w:t>Ana Francesca Stama</w:t>
             </w:r>
-            <w:proofErr w:type="spellStart"/>
-            <w:r>
-              <w:rPr>
-                <w:lang w:val="hr-HR"/>
-              </w:rPr>
-              <w:t>Stama</w:t>
-            </w:r>
-            <w:proofErr w:type="spellEnd"/>
           </w:p>
         </w:tc>
         <w:tc>
@@ -2743,213 +2208,6 @@
           </w:p>
         </w:tc>
       </w:tr>
-      <w:tr>
-        <w:trPr>
-          <w:jc w:val="center"/>
-        </w:trPr>
-        <w:tc>
-          <w:tcPr>
-            <w:tcW w:w="2056" w:type="dxa"/>
-            <w:vAlign w:val="center"/>
-          </w:tcPr>
-          <w:p>
-            <w:pPr>
-              <w:pStyle w:val="Tijeloteksta"/>
-              <w:ind w:left="0"/>
-              <w:jc w:val="center"/>
-              <w:rPr>
-                <w:lang w:val="hr-HR"/>
-              </w:rPr>
-            </w:pPr>
-          </w:p>
-        </w:tc>
-        <w:tc>
-          <w:tcPr>
-            <w:tcW w:w="2617" w:type="dxa"/>
-            <w:vAlign w:val="center"/>
-          </w:tcPr>
-          <w:p>
-            <w:pPr>
-              <w:pStyle w:val="Tijeloteksta"/>
-              <w:ind w:left="0"/>
-              <w:jc w:val="center"/>
-              <w:rPr>
-                <w:lang w:val="hr-HR"/>
-              </w:rPr>
-            </w:pPr>
-          </w:p>
-        </w:tc>
-        <w:tc>
-          <w:tcPr>
-            <w:tcW w:w="1487" w:type="dxa"/>
-            <w:vAlign w:val="center"/>
-          </w:tcPr>
-          <w:p>
-            <w:pPr>
-              <w:pStyle w:val="Tijeloteksta"/>
-              <w:ind w:left="0"/>
-              <w:jc w:val="center"/>
-              <w:rPr>
-                <w:lang w:val="hr-HR"/>
-              </w:rPr>
-            </w:pPr>
-          </w:p>
-        </w:tc>
-        <w:tc>
-          <w:tcPr>
-            <w:tcW w:w="3190" w:type="dxa"/>
-            <w:vAlign w:val="center"/>
-          </w:tcPr>
-          <w:p>
-            <w:pPr>
-              <w:pStyle w:val="Tijeloteksta"/>
-              <w:ind w:left="0"/>
-              <w:jc w:val="center"/>
-              <w:rPr>
-                <w:lang w:val="hr-HR"/>
-              </w:rPr>
-            </w:pPr>
-          </w:p>
-        </w:tc>
-      </w:tr>
-      <w:tr>
-        <w:trPr>
-          <w:jc w:val="center"/>
-        </w:trPr>
-        <w:tc>
-          <w:tcPr>
-            <w:tcW w:w="2056" w:type="dxa"/>
-            <w:vAlign w:val="center"/>
-          </w:tcPr>
-          <w:p>
-            <w:pPr>
-              <w:pStyle w:val="Tijeloteksta"/>
-              <w:ind w:left="0"/>
-              <w:jc w:val="center"/>
-              <w:rPr>
-                <w:lang w:val="hr-HR"/>
-              </w:rPr>
-            </w:pPr>
-          </w:p>
-        </w:tc>
-        <w:tc>
-          <w:tcPr>
-            <w:tcW w:w="2617" w:type="dxa"/>
-            <w:vAlign w:val="center"/>
-          </w:tcPr>
-          <w:p>
-            <w:pPr>
-              <w:pStyle w:val="Tijeloteksta"/>
-              <w:ind w:left="0"/>
-              <w:jc w:val="center"/>
-              <w:rPr>
-                <w:lang w:val="hr-HR"/>
-              </w:rPr>
-            </w:pPr>
-          </w:p>
-        </w:tc>
-        <w:tc>
-          <w:tcPr>
-            <w:tcW w:w="1487" w:type="dxa"/>
-            <w:vAlign w:val="center"/>
-          </w:tcPr>
-          <w:p>
-            <w:pPr>
-              <w:pStyle w:val="Tijeloteksta"/>
-              <w:ind w:left="0"/>
-              <w:jc w:val="center"/>
-              <w:rPr>
-                <w:lang w:val="hr-HR"/>
-              </w:rPr>
-            </w:pPr>
-          </w:p>
-        </w:tc>
-        <w:tc>
-          <w:tcPr>
-            <w:tcW w:w="3190" w:type="dxa"/>
-            <w:vAlign w:val="center"/>
-          </w:tcPr>
-          <w:p>
-            <w:pPr>
-              <w:pStyle w:val="Tijeloteksta"/>
-              <w:ind w:left="0"/>
-              <w:jc w:val="center"/>
-              <w:rPr>
-                <w:lang w:val="hr-HR"/>
-              </w:rPr>
-            </w:pPr>
-          </w:p>
-        </w:tc>
-      </w:tr>
-      <w:tr>
-        <w:trPr>
-          <w:jc w:val="center"/>
-        </w:trPr>
-        <w:tc>
-          <w:tcPr>
-            <w:tcW w:w="2056" w:type="dxa"/>
-            <w:vAlign w:val="center"/>
-          </w:tcPr>
-          <w:p>
-            <w:pPr>
-              <w:pStyle w:val="Tijeloteksta"/>
-              <w:ind w:left="0"/>
-              <w:jc w:val="center"/>
-              <w:rPr>
-                <w:lang w:val="hr-HR"/>
-              </w:rPr>
-            </w:pPr>
-          </w:p>
-        </w:tc>
-        <w:tc>
-          <w:tcPr>
-            <w:tcW w:w="2617" w:type="dxa"/>
-            <w:vAlign w:val="center"/>
-          </w:tcPr>
-          <w:p>
-            <w:pPr>
-              <w:pStyle w:val="Tijeloteksta"/>
-              <w:ind w:left="0"/>
-              <w:jc w:val="center"/>
-              <w:rPr>
-                <w:lang w:val="hr-HR"/>
-              </w:rPr>
-            </w:pPr>
-          </w:p>
-        </w:tc>
-        <w:tc>
-          <w:tcPr>
-            <w:tcW w:w="1487" w:type="dxa"/>
-            <w:vAlign w:val="center"/>
-          </w:tcPr>
-          <w:p>
-            <w:pPr>
-              <w:pStyle w:val="Tijeloteksta"/>
-              <w:ind w:left="0"/>
-              <w:jc w:val="center"/>
-              <w:rPr>
-                <w:lang w:val="hr-HR"/>
-              </w:rPr>
-            </w:pPr>
-          </w:p>
-        </w:tc>
-        <w:tc>
-          <w:tcPr>
-            <w:tcW w:w="3190" w:type="dxa"/>
-            <w:vAlign w:val="center"/>
-          </w:tcPr>
-          <w:p>
-            <w:pPr>
-              <w:pStyle w:val="Tijeloteksta"/>
-              <w:ind w:left="0"/>
-              <w:jc w:val="center"/>
-              <w:rPr>
-                <w:lang w:val="hr-HR"/>
-              </w:rPr>
-            </w:pPr>
-          </w:p>
-        </w:tc>
-      </w:tr>
     </w:tbl>
     <w:p>
       <w:pPr>
@@ -2963,38 +2221,13 @@
         <w:rPr>
           <w:lang w:val="hr-HR"/>
         </w:rPr>
+        <w:lastRenderedPageBreak/>
         <w:t>Glavni rizici</w:t>
       </w:r>
       <w:bookmarkEnd w:id="9"/>
     </w:p>
     <w:p>
       <w:pPr>
-        <w:pStyle w:val="InfoBlue"/>
-        <w:rPr>
-          <w:lang w:val="hr-HR"/>
-        </w:rPr>
-      </w:pPr>
-      <w:r>
-        <w:rPr>
-          <w:lang w:val="hr-HR"/>
-        </w:rPr>
-        <w:t>[</w:t>
-      </w:r>
-      <w:r>
-        <w:rPr>
-          <w:lang w:val="hr-HR"/>
-        </w:rPr>
-        <w:t>Navesti glavne zapreke za ostvarenje uspjeha projekta, te posljedice ukoliko projekt ne uspije</w:t>
-      </w:r>
-      <w:r>
-        <w:rPr>
-          <w:lang w:val="hr-HR"/>
-        </w:rPr>
-        <w:t>.]</w:t>
-      </w:r>
-    </w:p>
-    <w:p>
-      <w:pPr>
         <w:pStyle w:val="Tijeloteksta"/>
         <w:rPr>
           <w:lang w:val="hr-HR"/>
@@ -3045,32 +2278,6 @@
     </w:p>
     <w:p>
       <w:pPr>
-        <w:pStyle w:val="InfoBlue"/>
-        <w:rPr>
-          <w:lang w:val="hr-HR"/>
-        </w:rPr>
-      </w:pPr>
-      <w:r>
-        <w:rPr>
-          <w:lang w:val="hr-HR"/>
-        </w:rPr>
-        <w:t>[</w:t>
-      </w:r>
-      <w:r>
-        <w:rPr>
-          <w:lang w:val="hr-HR"/>
-        </w:rPr>
-        <w:t>Navesti korake koji će se poduzeti kako bi se što je moguće više umanjio svaki od prethodno navedenih rizika.</w:t>
-      </w:r>
-      <w:r>
-        <w:rPr>
-          <w:lang w:val="hr-HR"/>
-        </w:rPr>
-        <w:t>]</w:t>
-      </w:r>
-    </w:p>
-    <w:p>
-      <w:pPr>
         <w:pStyle w:val="Tijeloteksta"/>
         <w:rPr>
           <w:lang w:val="hr-HR"/>
@@ -3080,21 +2287,7 @@
         <w:rPr>
           <w:lang w:val="hr-HR"/>
         </w:rPr>
-        <w:t xml:space="preserve">Nedostatak predznanja u domeni kemije nastojat će se umanjiti proučavanjem dostupne literature te, po potrebi, savjetovanjem s domenskim stručnjakom. Potencijalni problem sa skupom podataka riješit će se </w:t>
-      </w:r>
-      <w:proofErr w:type="spellStart"/>
-      <w:r>
-        <w:rPr>
-          <w:lang w:val="hr-HR"/>
-        </w:rPr>
-        <w:t>eksploratornom</w:t>
-      </w:r>
-      <w:proofErr w:type="spellEnd"/>
-      <w:r>
-        <w:rPr>
-          <w:lang w:val="hr-HR"/>
-        </w:rPr>
-        <w:t xml:space="preserve"> analizom i vizualizacijom, a u slučaju nedoumica, i konzultacijama s domenskim stručnjakom.</w:t>
+        <w:t>Nedostatak predznanja u domeni kemije nastojat će se umanjiti proučavanjem dostupne literature te, po potrebi, savjetovanjem s domenskim stručnjakom. Potencijalni problem sa skupom podataka riješit će se eksploratornom analizom i vizualizacijom, a u slučaju nedoumica, i konzultacijama s domenskim stručnjakom.</w:t>
       </w:r>
       <w:r>
         <w:rPr>
@@ -3120,32 +2313,6 @@
       </w:r>
       <w:bookmarkEnd w:id="11"/>
       <w:bookmarkEnd w:id="12"/>
-    </w:p>
-    <w:p>
-      <w:pPr>
-        <w:pStyle w:val="InfoBlue"/>
-        <w:rPr>
-          <w:lang w:val="hr-HR"/>
-        </w:rPr>
-      </w:pPr>
-      <w:r>
-        <w:rPr>
-          <w:lang w:val="hr-HR"/>
-        </w:rPr>
-        <w:t xml:space="preserve">[Navesti </w:t>
-      </w:r>
-      <w:r>
-        <w:rPr>
-          <w:lang w:val="hr-HR"/>
-        </w:rPr>
-        <w:t>glavne faze projekta, te ukratko objašnjenje po kojem načelu je projekt podijeljen na te faze- vremenska organizacija, smanjenje rizika, raspoloživost resursa i/ili nešto drugo</w:t>
-      </w:r>
-      <w:r>
-        <w:rPr>
-          <w:lang w:val="hr-HR"/>
-        </w:rPr>
-        <w:t>.]</w:t>
-      </w:r>
     </w:p>
     <w:p>
       <w:pPr>
@@ -3162,21 +2329,7 @@
         <w:rPr>
           <w:lang w:val="hr-HR"/>
         </w:rPr>
-        <w:t xml:space="preserve">Priprema podataka: prikupljanje postojećeg skupa podataka koji sadrži informacije o molekulama u odabranom formatu iz baze </w:t>
-      </w:r>
-      <w:proofErr w:type="spellStart"/>
-      <w:r>
-        <w:rPr>
-          <w:lang w:val="hr-HR"/>
-        </w:rPr>
-        <w:t>PubChem</w:t>
-      </w:r>
-      <w:proofErr w:type="spellEnd"/>
-      <w:r>
-        <w:rPr>
-          <w:lang w:val="hr-HR"/>
-        </w:rPr>
-        <w:t>.</w:t>
+        <w:t>Priprema podataka: prikupljanje postojećeg skupa podataka koji sadrži informacije o molekulama u odabranom formatu iz baze PubChem.</w:t>
       </w:r>
     </w:p>
     <w:p>
@@ -3194,21 +2347,7 @@
         <w:rPr>
           <w:lang w:val="hr-HR"/>
         </w:rPr>
-        <w:t xml:space="preserve">Obrada podataka: </w:t>
-      </w:r>
-      <w:proofErr w:type="spellStart"/>
-      <w:r>
-        <w:rPr>
-          <w:lang w:val="hr-HR"/>
-        </w:rPr>
-        <w:t>eksploratorna</w:t>
-      </w:r>
-      <w:proofErr w:type="spellEnd"/>
-      <w:r>
-        <w:rPr>
-          <w:lang w:val="hr-HR"/>
-        </w:rPr>
-        <w:t xml:space="preserve"> analiza, čišćenje, i transformacija podataka</w:t>
+        <w:t>Obrada podataka: eksploratorna analiza, čišćenje, i transformacija podataka</w:t>
       </w:r>
     </w:p>
     <w:p>
@@ -3232,21 +2371,7 @@
         <w:rPr>
           <w:lang w:val="hr-HR"/>
         </w:rPr>
-        <w:t xml:space="preserve">više </w:t>
-      </w:r>
-      <w:proofErr w:type="spellStart"/>
-      <w:r>
-        <w:rPr>
-          <w:lang w:val="hr-HR"/>
-        </w:rPr>
-        <w:t>prediktivnih</w:t>
-      </w:r>
-      <w:proofErr w:type="spellEnd"/>
-      <w:r>
-        <w:rPr>
-          <w:lang w:val="hr-HR"/>
-        </w:rPr>
-        <w:t xml:space="preserve"> modela</w:t>
+        <w:t>više prediktivnih modela</w:t>
       </w:r>
       <w:r>
         <w:rPr>
@@ -3318,47 +2443,13 @@
         </w:rPr>
         <w:t xml:space="preserve">engl. </w:t>
       </w:r>
-      <w:proofErr w:type="spellStart"/>
       <w:r>
         <w:rPr>
           <w:i/>
           <w:lang w:val="hr-HR"/>
         </w:rPr>
-        <w:t>Work</w:t>
-      </w:r>
-      <w:proofErr w:type="spellEnd"/>
-      <w:r>
-        <w:rPr>
-          <w:i/>
-          <w:lang w:val="hr-HR"/>
-        </w:rPr>
-        <w:t xml:space="preserve"> </w:t>
-      </w:r>
-      <w:proofErr w:type="spellStart"/>
-      <w:r>
-        <w:rPr>
-          <w:i/>
-          <w:lang w:val="hr-HR"/>
-        </w:rPr>
-        <w:t>Breakdown</w:t>
-      </w:r>
-      <w:proofErr w:type="spellEnd"/>
-      <w:r>
-        <w:rPr>
-          <w:i/>
-          <w:lang w:val="hr-HR"/>
-        </w:rPr>
-        <w:t xml:space="preserve"> </w:t>
-      </w:r>
-      <w:proofErr w:type="spellStart"/>
-      <w:r>
-        <w:rPr>
-          <w:i/>
-          <w:lang w:val="hr-HR"/>
-        </w:rPr>
-        <w:t>Structure</w:t>
-      </w:r>
-      <w:proofErr w:type="spellEnd"/>
+        <w:t>Work Breakdown Structure</w:t>
+      </w:r>
       <w:r>
         <w:rPr>
           <w:lang w:val="hr-HR"/>
@@ -3376,32 +2467,6 @@
     </w:p>
     <w:p>
       <w:pPr>
-        <w:pStyle w:val="InfoBlue"/>
-        <w:rPr>
-          <w:lang w:val="hr-HR"/>
-        </w:rPr>
-      </w:pPr>
-      <w:r>
-        <w:rPr>
-          <w:lang w:val="hr-HR"/>
-        </w:rPr>
-        <w:t>[</w:t>
-      </w:r>
-      <w:r>
-        <w:rPr>
-          <w:lang w:val="hr-HR"/>
-        </w:rPr>
-        <w:t>Nacrtati WBS s navedenim aktivnostima projekta</w:t>
-      </w:r>
-      <w:r>
-        <w:rPr>
-          <w:lang w:val="hr-HR"/>
-        </w:rPr>
-        <w:t>.]</w:t>
-      </w:r>
-    </w:p>
-    <w:p>
-      <w:pPr>
         <w:pStyle w:val="StandardWeb"/>
         <w:rPr>
           <w:lang w:val="en-GB" w:eastAsia="en-GB"/>
@@ -3411,7 +2476,6 @@
         <w:rPr>
           <w:noProof/>
         </w:rPr>
-        <w:lastRenderedPageBreak/>
         <w:drawing>
           <wp:inline distT="0" distB="0" distL="0" distR="0" wp14:anchorId="2D429795" wp14:editId="27B782D4">
             <wp:extent cx="5943600" cy="2714625"/>
@@ -3491,7 +2555,6 @@
         </w:rPr>
         <w:t xml:space="preserve"> (engl. </w:t>
       </w:r>
-      <w:proofErr w:type="spellStart"/>
       <w:r>
         <w:rPr>
           <w:i/>
@@ -3500,110 +2563,11 @@
         </w:rPr>
         <w:t>milestones</w:t>
       </w:r>
-      <w:proofErr w:type="spellEnd"/>
       <w:r>
         <w:rPr>
           <w:lang w:val="hr-HR"/>
         </w:rPr>
         <w:t>)</w:t>
-      </w:r>
-    </w:p>
-    <w:p>
-      <w:pPr>
-        <w:pStyle w:val="InfoBlue"/>
-        <w:rPr>
-          <w:lang w:val="hr-HR"/>
-        </w:rPr>
-      </w:pPr>
-      <w:r>
-        <w:rPr>
-          <w:lang w:val="hr-HR"/>
-        </w:rPr>
-        <w:t>[</w:t>
-      </w:r>
-      <w:r>
-        <w:rPr>
-          <w:lang w:val="hr-HR"/>
-        </w:rPr>
-        <w:t>Općenito</w:t>
-      </w:r>
-      <w:r>
-        <w:rPr>
-          <w:lang w:val="hr-HR"/>
-        </w:rPr>
-        <w:t>,</w:t>
-      </w:r>
-      <w:r>
-        <w:rPr>
-          <w:lang w:val="hr-HR"/>
-        </w:rPr>
-        <w:t xml:space="preserve"> </w:t>
-      </w:r>
-      <w:r>
-        <w:rPr>
-          <w:lang w:val="hr-HR"/>
-        </w:rPr>
-        <w:t xml:space="preserve">kontrolna točka projekta </w:t>
-      </w:r>
-      <w:r>
-        <w:rPr>
-          <w:lang w:val="hr-HR"/>
-        </w:rPr>
-        <w:t xml:space="preserve">je događaj ili rezultat neke aktivnosti koji ukazuje na to </w:t>
-      </w:r>
-      <w:r>
-        <w:rPr>
-          <w:lang w:val="hr-HR"/>
-        </w:rPr>
-        <w:t>je li</w:t>
-      </w:r>
-      <w:r>
-        <w:rPr>
-          <w:lang w:val="hr-HR"/>
-        </w:rPr>
-        <w:t xml:space="preserve"> projekt u skladu sa zadanim rokovima ili kasni. Ta informacija se upisuje u kolonu o statusu projekta. Ako projekt kasni moraju se poduzeti akcije da se rokovi dostignu. Za svak</w:t>
-      </w:r>
-      <w:r>
-        <w:rPr>
-          <w:lang w:val="hr-HR"/>
-        </w:rPr>
-        <w:t>u</w:t>
-      </w:r>
-      <w:r>
-        <w:rPr>
-          <w:lang w:val="hr-HR"/>
-        </w:rPr>
-        <w:t xml:space="preserve"> </w:t>
-      </w:r>
-      <w:r>
-        <w:rPr>
-          <w:lang w:val="hr-HR"/>
-        </w:rPr>
-        <w:t>kontrolnu točku treba</w:t>
-      </w:r>
-      <w:r>
-        <w:rPr>
-          <w:lang w:val="hr-HR"/>
-        </w:rPr>
-        <w:t xml:space="preserve"> odrediti točan datum. </w:t>
-      </w:r>
-      <w:r>
-        <w:rPr>
-          <w:lang w:val="hr-HR"/>
-        </w:rPr>
-        <w:t>P</w:t>
-      </w:r>
-      <w:r>
-        <w:rPr>
-          <w:lang w:val="hr-HR"/>
-        </w:rPr>
-        <w:t>o potrebi se mogu dodavati ili oduzimati redovi tablice.</w:t>
-      </w:r>
-      <w:r>
-        <w:rPr>
-          <w:lang w:val="hr-HR"/>
-        </w:rPr>
-        <w:t>]</w:t>
       </w:r>
     </w:p>
     <w:p>
@@ -3667,6 +2631,7 @@
                 <w:b/>
                 <w:lang w:val="hr-HR"/>
               </w:rPr>
+              <w:lastRenderedPageBreak/>
               <w:t>Kontrolne točke</w:t>
             </w:r>
           </w:p>
@@ -3816,6 +2781,12 @@
                 <w:lang w:val="hr-HR"/>
               </w:rPr>
             </w:pPr>
+            <w:r>
+              <w:rPr>
+                <w:lang w:val="hr-HR"/>
+              </w:rPr>
+              <w:t>8.11.2024.</w:t>
+            </w:r>
           </w:p>
         </w:tc>
         <w:tc>
@@ -3832,6 +2803,12 @@
                 <w:lang w:val="hr-HR"/>
               </w:rPr>
             </w:pPr>
+            <w:r>
+              <w:rPr>
+                <w:lang w:val="hr-HR"/>
+              </w:rPr>
+              <w:t>U skladu s rokovima</w:t>
+            </w:r>
           </w:p>
         </w:tc>
       </w:tr>
@@ -3897,6 +2874,12 @@
                 <w:lang w:val="hr-HR"/>
               </w:rPr>
             </w:pPr>
+            <w:r>
+              <w:rPr>
+                <w:lang w:val="hr-HR"/>
+              </w:rPr>
+              <w:t>10.1.2025.</w:t>
+            </w:r>
           </w:p>
         </w:tc>
         <w:tc>
@@ -3913,6 +2896,12 @@
                 <w:lang w:val="hr-HR"/>
               </w:rPr>
             </w:pPr>
+            <w:r>
+              <w:rPr>
+                <w:lang w:val="hr-HR"/>
+              </w:rPr>
+              <w:t>U skladu s rokovima</w:t>
+            </w:r>
           </w:p>
         </w:tc>
       </w:tr>
@@ -3960,7 +2949,13 @@
               <w:rPr>
                 <w:lang w:val="hr-HR"/>
               </w:rPr>
-              <w:t>20.1.2025.</w:t>
+              <w:t>3</w:t>
+            </w:r>
+            <w:r>
+              <w:rPr>
+                <w:lang w:val="hr-HR"/>
+              </w:rPr>
+              <w:t>0.1.2025.</w:t>
             </w:r>
           </w:p>
         </w:tc>
@@ -3978,6 +2973,12 @@
                 <w:lang w:val="hr-HR"/>
               </w:rPr>
             </w:pPr>
+            <w:r>
+              <w:rPr>
+                <w:lang w:val="hr-HR"/>
+              </w:rPr>
+              <w:t>28.1.2025.</w:t>
+            </w:r>
           </w:p>
         </w:tc>
         <w:tc>
@@ -3994,143 +2995,12 @@
                 <w:lang w:val="hr-HR"/>
               </w:rPr>
             </w:pPr>
-          </w:p>
-        </w:tc>
-      </w:tr>
-      <w:tr>
-        <w:trPr>
-          <w:jc w:val="center"/>
-        </w:trPr>
-        <w:tc>
-          <w:tcPr>
-            <w:tcW w:w="2366" w:type="dxa"/>
-            <w:vAlign w:val="center"/>
-          </w:tcPr>
-          <w:p>
-            <w:pPr>
-              <w:pStyle w:val="Tijeloteksta"/>
-              <w:ind w:left="0"/>
-              <w:jc w:val="center"/>
-              <w:rPr>
-                <w:lang w:val="hr-HR"/>
-              </w:rPr>
-            </w:pPr>
-          </w:p>
-        </w:tc>
-        <w:tc>
-          <w:tcPr>
-            <w:tcW w:w="1259" w:type="dxa"/>
-            <w:vAlign w:val="center"/>
-          </w:tcPr>
-          <w:p>
-            <w:pPr>
-              <w:pStyle w:val="Tijeloteksta"/>
-              <w:ind w:left="0"/>
-              <w:jc w:val="center"/>
-              <w:rPr>
-                <w:lang w:val="hr-HR"/>
-              </w:rPr>
-            </w:pPr>
-          </w:p>
-        </w:tc>
-        <w:tc>
-          <w:tcPr>
-            <w:tcW w:w="2391" w:type="dxa"/>
-            <w:vAlign w:val="center"/>
-          </w:tcPr>
-          <w:p>
-            <w:pPr>
-              <w:pStyle w:val="Tijeloteksta"/>
-              <w:ind w:left="0"/>
-              <w:jc w:val="center"/>
-              <w:rPr>
-                <w:lang w:val="hr-HR"/>
-              </w:rPr>
-            </w:pPr>
-          </w:p>
-        </w:tc>
-        <w:tc>
-          <w:tcPr>
-            <w:tcW w:w="2333" w:type="dxa"/>
-            <w:vAlign w:val="center"/>
-          </w:tcPr>
-          <w:p>
-            <w:pPr>
-              <w:pStyle w:val="Tijeloteksta"/>
-              <w:ind w:left="0"/>
-              <w:jc w:val="center"/>
-              <w:rPr>
-                <w:lang w:val="hr-HR"/>
-              </w:rPr>
-            </w:pPr>
-          </w:p>
-        </w:tc>
-      </w:tr>
-      <w:tr>
-        <w:trPr>
-          <w:jc w:val="center"/>
-        </w:trPr>
-        <w:tc>
-          <w:tcPr>
-            <w:tcW w:w="2366" w:type="dxa"/>
-            <w:vAlign w:val="center"/>
-          </w:tcPr>
-          <w:p>
-            <w:pPr>
-              <w:pStyle w:val="Tijeloteksta"/>
-              <w:ind w:left="0"/>
-              <w:rPr>
-                <w:lang w:val="hr-HR"/>
-              </w:rPr>
-            </w:pPr>
-          </w:p>
-        </w:tc>
-        <w:tc>
-          <w:tcPr>
-            <w:tcW w:w="1259" w:type="dxa"/>
-            <w:vAlign w:val="center"/>
-          </w:tcPr>
-          <w:p>
-            <w:pPr>
-              <w:pStyle w:val="Tijeloteksta"/>
-              <w:ind w:left="0"/>
-              <w:jc w:val="center"/>
-              <w:rPr>
-                <w:lang w:val="hr-HR"/>
-              </w:rPr>
-            </w:pPr>
-          </w:p>
-        </w:tc>
-        <w:tc>
-          <w:tcPr>
-            <w:tcW w:w="2391" w:type="dxa"/>
-            <w:vAlign w:val="center"/>
-          </w:tcPr>
-          <w:p>
-            <w:pPr>
-              <w:pStyle w:val="Tijeloteksta"/>
-              <w:ind w:left="0"/>
-              <w:jc w:val="center"/>
-              <w:rPr>
-                <w:lang w:val="hr-HR"/>
-              </w:rPr>
-            </w:pPr>
-          </w:p>
-        </w:tc>
-        <w:tc>
-          <w:tcPr>
-            <w:tcW w:w="2333" w:type="dxa"/>
-            <w:vAlign w:val="center"/>
-          </w:tcPr>
-          <w:p>
-            <w:pPr>
-              <w:pStyle w:val="Tijeloteksta"/>
-              <w:ind w:left="0"/>
-              <w:jc w:val="center"/>
-              <w:rPr>
-                <w:lang w:val="hr-HR"/>
-              </w:rPr>
-            </w:pPr>
+            <w:r>
+              <w:rPr>
+                <w:lang w:val="hr-HR"/>
+              </w:rPr>
+              <w:t>U skladu s rokovima</w:t>
+            </w:r>
           </w:p>
         </w:tc>
       </w:tr>
@@ -4158,236 +3028,20 @@
     </w:p>
     <w:p>
       <w:pPr>
-        <w:rPr>
-          <w:lang w:val="hr-HR"/>
-        </w:rPr>
-      </w:pPr>
-    </w:p>
-    <w:p>
-      <w:pPr>
-        <w:rPr>
-          <w:lang w:val="hr-HR"/>
-        </w:rPr>
-      </w:pPr>
-    </w:p>
-    <w:p>
-      <w:pPr>
-        <w:rPr>
-          <w:lang w:val="hr-HR"/>
-        </w:rPr>
-      </w:pPr>
-    </w:p>
-    <w:p>
-      <w:pPr>
-        <w:rPr>
-          <w:lang w:val="hr-HR"/>
-        </w:rPr>
-      </w:pPr>
-    </w:p>
-    <w:p>
-      <w:pPr>
-        <w:rPr>
-          <w:lang w:val="hr-HR"/>
-        </w:rPr>
-      </w:pPr>
-    </w:p>
-    <w:p>
-      <w:pPr>
-        <w:rPr>
-          <w:lang w:val="hr-HR"/>
-        </w:rPr>
-      </w:pPr>
-    </w:p>
-    <w:p>
-      <w:pPr>
-        <w:rPr>
-          <w:lang w:val="hr-HR"/>
-        </w:rPr>
-      </w:pPr>
-    </w:p>
-    <w:p>
-      <w:pPr>
-        <w:rPr>
-          <w:lang w:val="hr-HR"/>
-        </w:rPr>
-      </w:pPr>
-    </w:p>
-    <w:p>
-      <w:pPr>
-        <w:rPr>
-          <w:lang w:val="hr-HR"/>
-        </w:rPr>
-      </w:pPr>
-    </w:p>
-    <w:p>
-      <w:pPr>
-        <w:rPr>
-          <w:lang w:val="hr-HR"/>
-        </w:rPr>
-      </w:pPr>
-    </w:p>
-    <w:p>
-      <w:pPr>
-        <w:rPr>
-          <w:lang w:val="hr-HR"/>
-        </w:rPr>
-      </w:pPr>
-    </w:p>
-    <w:p>
-      <w:pPr>
         <w:pStyle w:val="Naslov1"/>
         <w:rPr>
           <w:lang w:val="hr-HR"/>
         </w:rPr>
       </w:pPr>
       <w:bookmarkStart w:id="16" w:name="_Toc179182967"/>
-      <w:proofErr w:type="spellStart"/>
-      <w:r>
-        <w:rPr>
-          <w:lang w:val="hr-HR"/>
-        </w:rPr>
-        <w:lastRenderedPageBreak/>
+      <w:r>
+        <w:rPr>
+          <w:lang w:val="hr-HR"/>
+        </w:rPr>
         <w:t>Gantogram</w:t>
       </w:r>
+      <w:bookmarkStart w:id="17" w:name="_Toc179182968"/>
       <w:bookmarkEnd w:id="16"/>
-      <w:proofErr w:type="spellEnd"/>
-    </w:p>
-    <w:p>
-      <w:pPr>
-        <w:pStyle w:val="InfoBlue"/>
-        <w:rPr>
-          <w:lang w:val="hr-HR"/>
-        </w:rPr>
-      </w:pPr>
-      <w:r>
-        <w:rPr>
-          <w:lang w:val="hr-HR"/>
-        </w:rPr>
-        <w:t xml:space="preserve">[Izraditi </w:t>
-      </w:r>
-      <w:proofErr w:type="spellStart"/>
-      <w:r>
-        <w:rPr>
-          <w:lang w:val="hr-HR"/>
-        </w:rPr>
-        <w:t>Gantogram</w:t>
-      </w:r>
-      <w:proofErr w:type="spellEnd"/>
-      <w:r>
-        <w:rPr>
-          <w:lang w:val="hr-HR"/>
-        </w:rPr>
-        <w:t xml:space="preserve"> pomoću programa MS </w:t>
-      </w:r>
-      <w:r>
-        <w:rPr>
-          <w:lang w:val="hr-HR"/>
-        </w:rPr>
-        <w:t>P</w:t>
-      </w:r>
-      <w:r>
-        <w:rPr>
-          <w:lang w:val="hr-HR"/>
-        </w:rPr>
-        <w:t>roject, O</w:t>
-      </w:r>
-      <w:r>
-        <w:rPr>
-          <w:lang w:val="hr-HR"/>
-        </w:rPr>
-        <w:t xml:space="preserve">pen </w:t>
-      </w:r>
-      <w:proofErr w:type="spellStart"/>
-      <w:r>
-        <w:rPr>
-          <w:lang w:val="hr-HR"/>
-        </w:rPr>
-        <w:t>Workbench</w:t>
-      </w:r>
-      <w:proofErr w:type="spellEnd"/>
-      <w:r>
-        <w:rPr>
-          <w:lang w:val="hr-HR"/>
-        </w:rPr>
-        <w:t xml:space="preserve">, Microsoft Excel - </w:t>
-      </w:r>
-      <w:r>
-        <w:t>http://office.microsoft.com/hr-hr/excel/HA010346051050.aspx</w:t>
-      </w:r>
-      <w:r>
-        <w:t>,</w:t>
-      </w:r>
-      <w:r>
-        <w:rPr>
-          <w:lang w:val="hr-HR"/>
-        </w:rPr>
-        <w:t xml:space="preserve"> </w:t>
-      </w:r>
-      <w:r>
-        <w:rPr>
-          <w:lang w:val="hr-HR"/>
-        </w:rPr>
-        <w:t xml:space="preserve">i </w:t>
-      </w:r>
-      <w:r>
-        <w:rPr>
-          <w:lang w:val="hr-HR"/>
-        </w:rPr>
-        <w:t xml:space="preserve">sl. </w:t>
-      </w:r>
-      <w:r>
-        <w:rPr>
-          <w:lang w:val="hr-HR"/>
-        </w:rPr>
-        <w:t xml:space="preserve">Pohraniti prikaz </w:t>
-      </w:r>
-      <w:proofErr w:type="spellStart"/>
-      <w:r>
-        <w:rPr>
-          <w:lang w:val="hr-HR"/>
-        </w:rPr>
-        <w:t>Gantograma</w:t>
-      </w:r>
-      <w:proofErr w:type="spellEnd"/>
-      <w:r>
-        <w:rPr>
-          <w:lang w:val="hr-HR"/>
-        </w:rPr>
-        <w:t xml:space="preserve"> (</w:t>
-      </w:r>
-      <w:proofErr w:type="spellStart"/>
-      <w:r>
-        <w:rPr>
-          <w:lang w:val="hr-HR"/>
-        </w:rPr>
-        <w:t>screenshot</w:t>
-      </w:r>
-      <w:proofErr w:type="spellEnd"/>
-      <w:r>
-        <w:rPr>
-          <w:lang w:val="hr-HR"/>
-        </w:rPr>
-        <w:t>) i postaviti ga unutar ovog poglavlja kao ubačenu sliku.</w:t>
-      </w:r>
-      <w:r>
-        <w:rPr>
-          <w:lang w:val="hr-HR"/>
-        </w:rPr>
-        <w:t>]</w:t>
-      </w:r>
-    </w:p>
-    <w:p>
-      <w:pPr>
-        <w:pStyle w:val="Naslov1"/>
-        <w:numPr>
-          <w:ilvl w:val="0"/>
-          <w:numId w:val="0"/>
-        </w:numPr>
-        <w:rPr>
-          <w:lang w:val="hr-HR"/>
-        </w:rPr>
-      </w:pPr>
-      <w:bookmarkStart w:id="17" w:name="_Toc179182968"/>
     </w:p>
     <w:p>
       <w:pPr>
@@ -4501,62 +3155,6 @@
     </w:p>
     <w:p>
       <w:pPr>
-        <w:rPr>
-          <w:lang w:val="hr-HR"/>
-        </w:rPr>
-      </w:pPr>
-    </w:p>
-    <w:p>
-      <w:pPr>
-        <w:rPr>
-          <w:lang w:val="hr-HR"/>
-        </w:rPr>
-      </w:pPr>
-    </w:p>
-    <w:p>
-      <w:pPr>
-        <w:rPr>
-          <w:lang w:val="hr-HR"/>
-        </w:rPr>
-      </w:pPr>
-    </w:p>
-    <w:p>
-      <w:pPr>
-        <w:rPr>
-          <w:lang w:val="hr-HR"/>
-        </w:rPr>
-      </w:pPr>
-    </w:p>
-    <w:p>
-      <w:pPr>
-        <w:rPr>
-          <w:lang w:val="hr-HR"/>
-        </w:rPr>
-      </w:pPr>
-    </w:p>
-    <w:p>
-      <w:pPr>
-        <w:rPr>
-          <w:lang w:val="hr-HR"/>
-        </w:rPr>
-      </w:pPr>
-    </w:p>
-    <w:p>
-      <w:pPr>
-        <w:rPr>
-          <w:lang w:val="hr-HR"/>
-        </w:rPr>
-      </w:pPr>
-    </w:p>
-    <w:p>
-      <w:pPr>
-        <w:rPr>
-          <w:lang w:val="hr-HR"/>
-        </w:rPr>
-      </w:pPr>
-    </w:p>
-    <w:p>
-      <w:pPr>
         <w:pStyle w:val="Naslov1"/>
         <w:rPr>
           <w:lang w:val="hr-HR"/>
@@ -4566,36 +3164,9 @@
         <w:rPr>
           <w:lang w:val="hr-HR"/>
         </w:rPr>
-        <w:lastRenderedPageBreak/>
         <w:t>Zapisnici sastanaka</w:t>
       </w:r>
       <w:bookmarkEnd w:id="17"/>
-    </w:p>
-    <w:p>
-      <w:pPr>
-        <w:pStyle w:val="InfoBlue"/>
-        <w:rPr>
-          <w:lang w:val="hr-HR"/>
-        </w:rPr>
-      </w:pPr>
-      <w:r>
-        <w:rPr>
-          <w:lang w:val="hr-HR"/>
-        </w:rPr>
-        <w:t>[Ovdje za svaki održani sastanak navesti: datum, vrijeme i mjesto održavanja sastanaka, popis nazočnih, glavne zaključke sastanka</w:t>
-      </w:r>
-      <w:r>
-        <w:rPr>
-          <w:lang w:val="hr-HR"/>
-        </w:rPr>
-        <w:t>.</w:t>
-      </w:r>
-      <w:r>
-        <w:rPr>
-          <w:lang w:val="hr-HR"/>
-        </w:rPr>
-        <w:t>]</w:t>
-      </w:r>
     </w:p>
     <w:p>
       <w:pPr>
@@ -4614,6 +3185,235 @@
           <w:lang w:val="hr-HR"/>
         </w:rPr>
         <w:t>6.11.2024., 18.00, Zagreb; nazočni: svi; pisanje plana projekta</w:t>
+      </w:r>
+    </w:p>
+    <w:p>
+      <w:pPr>
+        <w:pStyle w:val="Tijeloteksta"/>
+        <w:keepLines w:val="0"/>
+        <w:numPr>
+          <w:ilvl w:val="0"/>
+          <w:numId w:val="9"/>
+        </w:numPr>
+        <w:rPr>
+          <w:lang w:val="hr-HR"/>
+        </w:rPr>
+      </w:pPr>
+      <w:r>
+        <w:rPr>
+          <w:lang w:val="hr-HR"/>
+        </w:rPr>
+        <w:lastRenderedPageBreak/>
+        <w:t xml:space="preserve">18.12.2024., 10.00, online, </w:t>
+      </w:r>
+      <w:r>
+        <w:rPr>
+          <w:lang w:val="hr-HR"/>
+        </w:rPr>
+        <w:t xml:space="preserve">nazočni: svi; </w:t>
+      </w:r>
+      <w:r>
+        <w:rPr>
+          <w:lang w:val="hr-HR"/>
+        </w:rPr>
+        <w:t>pregled odrađenog i savjeti za dalje od mentora i suradnika</w:t>
+      </w:r>
+    </w:p>
+    <w:p>
+      <w:pPr>
+        <w:pStyle w:val="Tijeloteksta"/>
+        <w:keepLines w:val="0"/>
+        <w:numPr>
+          <w:ilvl w:val="0"/>
+          <w:numId w:val="9"/>
+        </w:numPr>
+        <w:rPr>
+          <w:lang w:val="hr-HR"/>
+        </w:rPr>
+      </w:pPr>
+      <w:r>
+        <w:rPr>
+          <w:lang w:val="hr-HR"/>
+        </w:rPr>
+        <w:t xml:space="preserve">20.12.2024., 12.00, online, </w:t>
+      </w:r>
+      <w:r>
+        <w:rPr>
+          <w:lang w:val="hr-HR"/>
+        </w:rPr>
+        <w:t>nazočni: svi;</w:t>
+      </w:r>
+      <w:r>
+        <w:rPr>
+          <w:lang w:val="hr-HR"/>
+        </w:rPr>
+        <w:t xml:space="preserve"> pregled odrađenog i podjela zadataka</w:t>
+      </w:r>
+    </w:p>
+    <w:p>
+      <w:pPr>
+        <w:pStyle w:val="Tijeloteksta"/>
+        <w:keepLines w:val="0"/>
+        <w:numPr>
+          <w:ilvl w:val="0"/>
+          <w:numId w:val="9"/>
+        </w:numPr>
+        <w:rPr>
+          <w:lang w:val="hr-HR"/>
+        </w:rPr>
+      </w:pPr>
+      <w:r>
+        <w:rPr>
+          <w:lang w:val="hr-HR"/>
+        </w:rPr>
+        <w:t xml:space="preserve">5.1.2024., 9.00, online, </w:t>
+      </w:r>
+      <w:r>
+        <w:rPr>
+          <w:lang w:val="hr-HR"/>
+        </w:rPr>
+        <w:t xml:space="preserve">nazočni: </w:t>
+      </w:r>
+      <w:r>
+        <w:rPr>
+          <w:lang w:val="hr-HR"/>
+        </w:rPr>
+        <w:t>Toni Borina, Ana Francesca Stama</w:t>
+      </w:r>
+      <w:r>
+        <w:rPr>
+          <w:lang w:val="hr-HR"/>
+        </w:rPr>
+        <w:t>; pregled odrađenog</w:t>
+      </w:r>
+      <w:r>
+        <w:rPr>
+          <w:lang w:val="hr-HR"/>
+        </w:rPr>
+        <w:t xml:space="preserve">, </w:t>
+      </w:r>
+      <w:r>
+        <w:rPr>
+          <w:lang w:val="hr-HR"/>
+        </w:rPr>
+        <w:t xml:space="preserve">završen preprocessing, </w:t>
+      </w:r>
+      <w:r>
+        <w:rPr>
+          <w:lang w:val="hr-HR"/>
+        </w:rPr>
+        <w:t>dogovor oko dodatnih modela za implementaciju</w:t>
+      </w:r>
+    </w:p>
+    <w:p>
+      <w:pPr>
+        <w:pStyle w:val="Tijeloteksta"/>
+        <w:keepLines w:val="0"/>
+        <w:numPr>
+          <w:ilvl w:val="0"/>
+          <w:numId w:val="9"/>
+        </w:numPr>
+        <w:rPr>
+          <w:lang w:val="hr-HR"/>
+        </w:rPr>
+      </w:pPr>
+      <w:r>
+        <w:rPr>
+          <w:lang w:val="hr-HR"/>
+        </w:rPr>
+        <w:t>7.1.2024. 18.00, online</w:t>
+      </w:r>
+      <w:r>
+        <w:rPr>
+          <w:lang w:val="hr-HR"/>
+        </w:rPr>
+        <w:t>, nazočni: svi; pregled odrađenog</w:t>
+      </w:r>
+      <w:r>
+        <w:rPr>
+          <w:lang w:val="hr-HR"/>
+        </w:rPr>
+        <w:t>, brainstorming oko mogućnosti nadogradnje</w:t>
+      </w:r>
+      <w:r>
+        <w:rPr>
+          <w:lang w:val="hr-HR"/>
+        </w:rPr>
+        <w:t xml:space="preserve"> implementacije</w:t>
+      </w:r>
+    </w:p>
+    <w:p>
+      <w:pPr>
+        <w:pStyle w:val="Tijeloteksta"/>
+        <w:keepLines w:val="0"/>
+        <w:numPr>
+          <w:ilvl w:val="0"/>
+          <w:numId w:val="9"/>
+        </w:numPr>
+        <w:rPr>
+          <w:lang w:val="hr-HR"/>
+        </w:rPr>
+      </w:pPr>
+      <w:r>
+        <w:rPr>
+          <w:lang w:val="hr-HR"/>
+        </w:rPr>
+        <w:t>17.1.2024. 10:00</w:t>
+      </w:r>
+      <w:r>
+        <w:rPr>
+          <w:lang w:val="hr-HR"/>
+        </w:rPr>
+        <w:t xml:space="preserve">, online, nazočni: svi; </w:t>
+      </w:r>
+      <w:r>
+        <w:rPr>
+          <w:lang w:val="hr-HR"/>
+        </w:rPr>
+        <w:t>dogovor oko prezentacije mentoru</w:t>
+      </w:r>
+      <w:r>
+        <w:rPr>
+          <w:lang w:val="hr-HR"/>
+        </w:rPr>
+        <w:t xml:space="preserve">, prolazak eventualnih </w:t>
+      </w:r>
+      <w:r>
+        <w:rPr>
+          <w:lang w:val="hr-HR"/>
+        </w:rPr>
+        <w:t>nedoumica</w:t>
+      </w:r>
+    </w:p>
+    <w:p>
+      <w:pPr>
+        <w:pStyle w:val="Tijeloteksta"/>
+        <w:keepLines w:val="0"/>
+        <w:numPr>
+          <w:ilvl w:val="0"/>
+          <w:numId w:val="9"/>
+        </w:numPr>
+        <w:rPr>
+          <w:lang w:val="hr-HR"/>
+        </w:rPr>
+      </w:pPr>
+      <w:r>
+        <w:rPr>
+          <w:lang w:val="hr-HR"/>
+        </w:rPr>
+        <w:t xml:space="preserve">17.1.2024. 10:45, </w:t>
+      </w:r>
+      <w:r>
+        <w:rPr>
+          <w:lang w:val="hr-HR"/>
+        </w:rPr>
+        <w:t xml:space="preserve">online, nazočni: svi; </w:t>
+      </w:r>
+      <w:r>
+        <w:rPr>
+          <w:lang w:val="hr-HR"/>
+        </w:rPr>
+        <w:t>završna prezentacija mentoru i suradnicima</w:t>
       </w:r>
     </w:p>
     <w:p>
@@ -4753,19 +3553,7 @@
               <w:rPr>
                 <w:lang w:val="hr-HR"/>
               </w:rPr>
-              <w:t>&lt; Ime</w:t>
-            </w:r>
-            <w:r>
-              <w:rPr>
-                <w:lang w:val="hr-HR"/>
-              </w:rPr>
-              <w:t xml:space="preserve"> i prezime</w:t>
-            </w:r>
-            <w:r>
-              <w:rPr>
-                <w:lang w:val="hr-HR"/>
-              </w:rPr>
-              <w:t xml:space="preserve"> &gt;</w:t>
+              <w:t>Toni Borina</w:t>
             </w:r>
           </w:p>
         </w:tc>
@@ -4791,7 +3579,13 @@
               <w:rPr>
                 <w:lang w:val="hr-HR"/>
               </w:rPr>
-              <w:t>Datum: ____________</w:t>
+              <w:t>Datum:</w:t>
+            </w:r>
+            <w:r>
+              <w:rPr>
+                <w:lang w:val="hr-HR"/>
+              </w:rPr>
+              <w:t xml:space="preserve"> 26.1.2024.</w:t>
             </w:r>
             <w:r>
               <w:rPr>
@@ -4803,7 +3597,13 @@
               <w:rPr>
                 <w:lang w:val="hr-HR"/>
               </w:rPr>
-              <w:t>: ____________</w:t>
+              <w:t xml:space="preserve">: </w:t>
+            </w:r>
+            <w:r>
+              <w:rPr>
+                <w:lang w:val="hr-HR"/>
+              </w:rPr>
+              <w:t>Toni Borina</w:t>
             </w:r>
           </w:p>
         </w:tc>
@@ -4834,19 +3634,7 @@
               <w:rPr>
                 <w:lang w:val="hr-HR"/>
               </w:rPr>
-              <w:t>&lt; Ime</w:t>
-            </w:r>
-            <w:r>
-              <w:rPr>
-                <w:lang w:val="hr-HR"/>
-              </w:rPr>
-              <w:t xml:space="preserve"> i prezime</w:t>
-            </w:r>
-            <w:r>
-              <w:rPr>
-                <w:lang w:val="hr-HR"/>
-              </w:rPr>
-              <w:t xml:space="preserve"> &gt;</w:t>
+              <w:t>Ana Francesca Stama</w:t>
             </w:r>
           </w:p>
         </w:tc>
@@ -4872,19 +3660,31 @@
               <w:rPr>
                 <w:lang w:val="hr-HR"/>
               </w:rPr>
-              <w:t>Datum: ____________</w:t>
+              <w:t xml:space="preserve">Datum: </w:t>
             </w:r>
             <w:r>
               <w:rPr>
                 <w:lang w:val="hr-HR"/>
               </w:rPr>
-              <w:t xml:space="preserve">   Potpis</w:t>
+              <w:t xml:space="preserve">26.1.2024.   </w:t>
             </w:r>
             <w:r>
               <w:rPr>
                 <w:lang w:val="hr-HR"/>
               </w:rPr>
-              <w:t>: ____________</w:t>
+              <w:t xml:space="preserve"> Potpis</w:t>
+            </w:r>
+            <w:r>
+              <w:rPr>
+                <w:lang w:val="hr-HR"/>
+              </w:rPr>
+              <w:t xml:space="preserve">: </w:t>
+            </w:r>
+            <w:r>
+              <w:rPr>
+                <w:lang w:val="hr-HR"/>
+              </w:rPr>
+              <w:t>Ana Francesca Stama</w:t>
             </w:r>
           </w:p>
         </w:tc>
@@ -4915,19 +3715,7 @@
               <w:rPr>
                 <w:lang w:val="hr-HR"/>
               </w:rPr>
-              <w:t>&lt; Ime</w:t>
-            </w:r>
-            <w:r>
-              <w:rPr>
-                <w:lang w:val="hr-HR"/>
-              </w:rPr>
-              <w:t xml:space="preserve"> i prezime</w:t>
-            </w:r>
-            <w:r>
-              <w:rPr>
-                <w:lang w:val="hr-HR"/>
-              </w:rPr>
-              <w:t xml:space="preserve"> &gt;</w:t>
+              <w:t>Ana Vrabec</w:t>
             </w:r>
           </w:p>
         </w:tc>
@@ -4953,424 +3741,31 @@
               <w:rPr>
                 <w:lang w:val="hr-HR"/>
               </w:rPr>
-              <w:t>Datum: ____________</w:t>
+              <w:t xml:space="preserve">Datum: </w:t>
             </w:r>
             <w:r>
               <w:rPr>
                 <w:lang w:val="hr-HR"/>
               </w:rPr>
-              <w:t xml:space="preserve">   Potpis</w:t>
+              <w:t xml:space="preserve">26.1.2024.   </w:t>
             </w:r>
             <w:r>
               <w:rPr>
                 <w:lang w:val="hr-HR"/>
               </w:rPr>
-              <w:t>: ____________</w:t>
-            </w:r>
-          </w:p>
-        </w:tc>
-      </w:tr>
-      <w:tr>
-        <w:trPr>
-          <w:trHeight w:val="345"/>
-        </w:trPr>
-        <w:tc>
-          <w:tcPr>
-            <w:tcW w:w="4620" w:type="dxa"/>
-            <w:tcBorders>
-              <w:top w:val="nil"/>
-              <w:left w:val="nil"/>
-              <w:bottom w:val="nil"/>
-              <w:right w:val="nil"/>
-            </w:tcBorders>
-          </w:tcPr>
-          <w:p>
-            <w:pPr>
-              <w:pStyle w:val="Zaglavlje"/>
-              <w:spacing w:before="120" w:after="120"/>
-              <w:rPr>
-                <w:lang w:val="hr-HR"/>
-              </w:rPr>
-            </w:pPr>
-            <w:r>
-              <w:rPr>
-                <w:lang w:val="hr-HR"/>
-              </w:rPr>
-              <w:t>&lt; Ime</w:t>
+              <w:t xml:space="preserve">  Potpis</w:t>
             </w:r>
             <w:r>
               <w:rPr>
                 <w:lang w:val="hr-HR"/>
               </w:rPr>
-              <w:t xml:space="preserve"> i prezime</w:t>
+              <w:t xml:space="preserve">: </w:t>
             </w:r>
             <w:r>
               <w:rPr>
                 <w:lang w:val="hr-HR"/>
               </w:rPr>
-              <w:t xml:space="preserve"> &gt;</w:t>
-            </w:r>
-          </w:p>
-        </w:tc>
-        <w:tc>
-          <w:tcPr>
-            <w:tcW w:w="4622" w:type="dxa"/>
-            <w:tcBorders>
-              <w:top w:val="nil"/>
-              <w:left w:val="nil"/>
-              <w:bottom w:val="nil"/>
-              <w:right w:val="nil"/>
-            </w:tcBorders>
-          </w:tcPr>
-          <w:p>
-            <w:pPr>
-              <w:pStyle w:val="Zaglavlje"/>
-              <w:spacing w:before="120" w:after="120"/>
-              <w:rPr>
-                <w:lang w:val="hr-HR"/>
-              </w:rPr>
-            </w:pPr>
-            <w:r>
-              <w:rPr>
-                <w:lang w:val="hr-HR"/>
-              </w:rPr>
-              <w:t>Datum: ____________</w:t>
-            </w:r>
-            <w:r>
-              <w:rPr>
-                <w:lang w:val="hr-HR"/>
-              </w:rPr>
-              <w:t xml:space="preserve">   Potpis</w:t>
-            </w:r>
-            <w:r>
-              <w:rPr>
-                <w:lang w:val="hr-HR"/>
-              </w:rPr>
-              <w:t>: ____________</w:t>
-            </w:r>
-          </w:p>
-        </w:tc>
-      </w:tr>
-      <w:tr>
-        <w:trPr>
-          <w:trHeight w:val="345"/>
-        </w:trPr>
-        <w:tc>
-          <w:tcPr>
-            <w:tcW w:w="4620" w:type="dxa"/>
-            <w:tcBorders>
-              <w:top w:val="nil"/>
-              <w:left w:val="nil"/>
-              <w:bottom w:val="nil"/>
-              <w:right w:val="nil"/>
-            </w:tcBorders>
-          </w:tcPr>
-          <w:p>
-            <w:pPr>
-              <w:pStyle w:val="Zaglavlje"/>
-              <w:spacing w:before="120" w:after="120"/>
-              <w:rPr>
-                <w:lang w:val="hr-HR"/>
-              </w:rPr>
-            </w:pPr>
-            <w:r>
-              <w:rPr>
-                <w:lang w:val="hr-HR"/>
-              </w:rPr>
-              <w:t>&lt; Ime</w:t>
-            </w:r>
-            <w:r>
-              <w:rPr>
-                <w:lang w:val="hr-HR"/>
-              </w:rPr>
-              <w:t xml:space="preserve"> i prezime</w:t>
-            </w:r>
-            <w:r>
-              <w:rPr>
-                <w:lang w:val="hr-HR"/>
-              </w:rPr>
-              <w:t xml:space="preserve"> &gt;</w:t>
-            </w:r>
-          </w:p>
-        </w:tc>
-        <w:tc>
-          <w:tcPr>
-            <w:tcW w:w="4622" w:type="dxa"/>
-            <w:tcBorders>
-              <w:top w:val="nil"/>
-              <w:left w:val="nil"/>
-              <w:bottom w:val="nil"/>
-              <w:right w:val="nil"/>
-            </w:tcBorders>
-          </w:tcPr>
-          <w:p>
-            <w:pPr>
-              <w:pStyle w:val="Zaglavlje"/>
-              <w:spacing w:before="120" w:after="120"/>
-              <w:rPr>
-                <w:lang w:val="hr-HR"/>
-              </w:rPr>
-            </w:pPr>
-            <w:r>
-              <w:rPr>
-                <w:lang w:val="hr-HR"/>
-              </w:rPr>
-              <w:t>Datum: ____________</w:t>
-            </w:r>
-            <w:r>
-              <w:rPr>
-                <w:lang w:val="hr-HR"/>
-              </w:rPr>
-              <w:t xml:space="preserve">   Potpis</w:t>
-            </w:r>
-            <w:r>
-              <w:rPr>
-                <w:lang w:val="hr-HR"/>
-              </w:rPr>
-              <w:t>: ____________</w:t>
-            </w:r>
-          </w:p>
-        </w:tc>
-      </w:tr>
-      <w:tr>
-        <w:trPr>
-          <w:trHeight w:val="345"/>
-        </w:trPr>
-        <w:tc>
-          <w:tcPr>
-            <w:tcW w:w="4620" w:type="dxa"/>
-            <w:tcBorders>
-              <w:top w:val="nil"/>
-              <w:left w:val="nil"/>
-              <w:bottom w:val="nil"/>
-              <w:right w:val="nil"/>
-            </w:tcBorders>
-          </w:tcPr>
-          <w:p>
-            <w:pPr>
-              <w:pStyle w:val="Zaglavlje"/>
-              <w:spacing w:before="120" w:after="120"/>
-              <w:rPr>
-                <w:lang w:val="hr-HR"/>
-              </w:rPr>
-            </w:pPr>
-            <w:r>
-              <w:rPr>
-                <w:lang w:val="hr-HR"/>
-              </w:rPr>
-              <w:t>&lt; Ime</w:t>
-            </w:r>
-            <w:r>
-              <w:rPr>
-                <w:lang w:val="hr-HR"/>
-              </w:rPr>
-              <w:t xml:space="preserve"> i prezime</w:t>
-            </w:r>
-            <w:r>
-              <w:rPr>
-                <w:lang w:val="hr-HR"/>
-              </w:rPr>
-              <w:t xml:space="preserve"> &gt;</w:t>
-            </w:r>
-          </w:p>
-        </w:tc>
-        <w:tc>
-          <w:tcPr>
-            <w:tcW w:w="4622" w:type="dxa"/>
-            <w:tcBorders>
-              <w:top w:val="nil"/>
-              <w:left w:val="nil"/>
-              <w:bottom w:val="nil"/>
-              <w:right w:val="nil"/>
-            </w:tcBorders>
-          </w:tcPr>
-          <w:p>
-            <w:pPr>
-              <w:pStyle w:val="Zaglavlje"/>
-              <w:spacing w:before="120" w:after="120"/>
-              <w:rPr>
-                <w:lang w:val="hr-HR"/>
-              </w:rPr>
-            </w:pPr>
-            <w:r>
-              <w:rPr>
-                <w:lang w:val="hr-HR"/>
-              </w:rPr>
-              <w:t>Datum: ____________</w:t>
-            </w:r>
-            <w:r>
-              <w:rPr>
-                <w:lang w:val="hr-HR"/>
-              </w:rPr>
-              <w:t xml:space="preserve">   Potpis</w:t>
-            </w:r>
-            <w:r>
-              <w:rPr>
-                <w:lang w:val="hr-HR"/>
-              </w:rPr>
-              <w:t>: ____________</w:t>
-            </w:r>
-          </w:p>
-        </w:tc>
-      </w:tr>
-      <w:tr>
-        <w:trPr>
-          <w:trHeight w:val="345"/>
-        </w:trPr>
-        <w:tc>
-          <w:tcPr>
-            <w:tcW w:w="4620" w:type="dxa"/>
-            <w:tcBorders>
-              <w:top w:val="nil"/>
-              <w:left w:val="nil"/>
-              <w:bottom w:val="nil"/>
-              <w:right w:val="nil"/>
-            </w:tcBorders>
-          </w:tcPr>
-          <w:p>
-            <w:pPr>
-              <w:pStyle w:val="Zaglavlje"/>
-              <w:spacing w:before="120" w:after="120"/>
-              <w:rPr>
-                <w:lang w:val="hr-HR"/>
-              </w:rPr>
-            </w:pPr>
-            <w:r>
-              <w:rPr>
-                <w:lang w:val="hr-HR"/>
-              </w:rPr>
-              <w:t>&lt; Ime</w:t>
-            </w:r>
-            <w:r>
-              <w:rPr>
-                <w:lang w:val="hr-HR"/>
-              </w:rPr>
-              <w:t xml:space="preserve"> i prezime</w:t>
-            </w:r>
-            <w:r>
-              <w:rPr>
-                <w:lang w:val="hr-HR"/>
-              </w:rPr>
-              <w:t xml:space="preserve"> &gt;</w:t>
-            </w:r>
-          </w:p>
-        </w:tc>
-        <w:tc>
-          <w:tcPr>
-            <w:tcW w:w="4622" w:type="dxa"/>
-            <w:tcBorders>
-              <w:top w:val="nil"/>
-              <w:left w:val="nil"/>
-              <w:bottom w:val="nil"/>
-              <w:right w:val="nil"/>
-            </w:tcBorders>
-          </w:tcPr>
-          <w:p>
-            <w:pPr>
-              <w:pStyle w:val="Zaglavlje"/>
-              <w:spacing w:before="120" w:after="120"/>
-              <w:rPr>
-                <w:lang w:val="hr-HR"/>
-              </w:rPr>
-            </w:pPr>
-            <w:r>
-              <w:rPr>
-                <w:lang w:val="hr-HR"/>
-              </w:rPr>
-              <w:t>Datum: ____________</w:t>
-            </w:r>
-            <w:r>
-              <w:rPr>
-                <w:lang w:val="hr-HR"/>
-              </w:rPr>
-              <w:t xml:space="preserve">   Potpis</w:t>
-            </w:r>
-            <w:r>
-              <w:rPr>
-                <w:lang w:val="hr-HR"/>
-              </w:rPr>
-              <w:t>: ____________</w:t>
-            </w:r>
-          </w:p>
-        </w:tc>
-      </w:tr>
-      <w:tr>
-        <w:trPr>
-          <w:trHeight w:val="345"/>
-        </w:trPr>
-        <w:tc>
-          <w:tcPr>
-            <w:tcW w:w="4620" w:type="dxa"/>
-            <w:tcBorders>
-              <w:top w:val="nil"/>
-              <w:left w:val="nil"/>
-              <w:bottom w:val="nil"/>
-              <w:right w:val="nil"/>
-            </w:tcBorders>
-          </w:tcPr>
-          <w:p>
-            <w:pPr>
-              <w:pStyle w:val="Zaglavlje"/>
-              <w:spacing w:before="120" w:after="120"/>
-              <w:rPr>
-                <w:lang w:val="hr-HR"/>
-              </w:rPr>
-            </w:pPr>
-            <w:r>
-              <w:rPr>
-                <w:lang w:val="hr-HR"/>
-              </w:rPr>
-              <w:t>&lt; Ime</w:t>
-            </w:r>
-            <w:r>
-              <w:rPr>
-                <w:lang w:val="hr-HR"/>
-              </w:rPr>
-              <w:t xml:space="preserve"> i prezime</w:t>
-            </w:r>
-            <w:r>
-              <w:rPr>
-                <w:lang w:val="hr-HR"/>
-              </w:rPr>
-              <w:t xml:space="preserve"> &gt;</w:t>
-            </w:r>
-          </w:p>
-        </w:tc>
-        <w:tc>
-          <w:tcPr>
-            <w:tcW w:w="4622" w:type="dxa"/>
-            <w:tcBorders>
-              <w:top w:val="nil"/>
-              <w:left w:val="nil"/>
-              <w:bottom w:val="nil"/>
-              <w:right w:val="nil"/>
-            </w:tcBorders>
-          </w:tcPr>
-          <w:p>
-            <w:pPr>
-              <w:pStyle w:val="Zaglavlje"/>
-              <w:spacing w:before="120" w:after="120"/>
-              <w:rPr>
-                <w:lang w:val="hr-HR"/>
-              </w:rPr>
-            </w:pPr>
-            <w:r>
-              <w:rPr>
-                <w:lang w:val="hr-HR"/>
-              </w:rPr>
-              <w:t>Datum: ____________</w:t>
-            </w:r>
-            <w:r>
-              <w:rPr>
-                <w:lang w:val="hr-HR"/>
-              </w:rPr>
-              <w:t xml:space="preserve">   Potpis</w:t>
-            </w:r>
-            <w:r>
-              <w:rPr>
-                <w:lang w:val="hr-HR"/>
-              </w:rPr>
-              <w:t>: ____________</w:t>
+              <w:t>Ana Vrabec</w:t>
             </w:r>
           </w:p>
         </w:tc>
@@ -5379,6 +3774,7 @@
     <w:p>
       <w:pPr>
         <w:pStyle w:val="Tijeloteksta"/>
+        <w:ind w:left="0"/>
         <w:rPr>
           <w:lang w:val="hr-HR"/>
         </w:rPr>
@@ -5656,7 +4052,7 @@
 </file>
 
 <file path=word/endnotes.xml><?xml version="1.0" encoding="utf-8"?>
-<w:endnotes xmlns:wpc="http://schemas.microsoft.com/office/word/2010/wordprocessingCanvas" xmlns:cx="http://schemas.microsoft.com/office/drawing/2014/chartex" xmlns:cx1="http://schemas.microsoft.com/office/drawing/2015/9/8/chartex" xmlns:cx2="http://schemas.microsoft.com/office/drawing/2015/10/21/chartex" xmlns:cx3="http://schemas.microsoft.com/office/drawing/2016/5/9/chartex" xmlns:cx4="http://schemas.microsoft.com/office/drawing/2016/5/10/chartex" xmlns:cx5="http://schemas.microsoft.com/office/drawing/2016/5/11/chartex" xmlns:cx6="http://schemas.microsoft.com/office/drawing/2016/5/12/chartex" xmlns:cx7="http://schemas.microsoft.com/office/drawing/2016/5/13/chartex" xmlns:cx8="http://schemas.microsoft.com/office/drawing/2016/5/14/chartex" xmlns:mc="http://schemas.openxmlformats.org/markup-compatibility/2006" xmlns:aink="http://schemas.microsoft.com/office/drawing/2016/ink" xmlns:am3d="http://schemas.microsoft.com/office/drawing/2017/model3d" xmlns:o="urn:schemas-microsoft-com:office:office" xmlns:oel="http://schemas.microsoft.com/office/2019/extlst" xmlns:r="http://schemas.openxmlformats.org/officeDocument/2006/relationships" xmlns:m="http://schemas.openxmlformats.org/officeDocument/2006/math" xmlns:v="urn:schemas-microsoft-com:vml" xmlns:wp14="http://schemas.microsoft.com/office/word/2010/wordprocessingDrawing" xmlns:wp="http://schemas.openxmlformats.org/drawingml/2006/wordprocessingDrawing" xmlns:w10="urn:schemas-microsoft-com:office:word" xmlns:w="http://schemas.openxmlformats.org/wordprocessingml/2006/main" xmlns:w14="http://schemas.microsoft.com/office/word/2010/wordml" xmlns:w15="http://schemas.microsoft.com/office/word/2012/wordml" xmlns:w16cex="http://schemas.microsoft.com/office/word/2018/wordml/cex" xmlns:w16cid="http://schemas.microsoft.com/office/word/2016/wordml/cid" xmlns:w16="http://schemas.microsoft.com/office/word/2018/wordml" xmlns:w16du="http://schemas.microsoft.com/office/word/2023/wordml/word16du" xmlns:w16sdtdh="http://schemas.microsoft.com/office/word/2020/wordml/sdtdatahash" xmlns:w16se="http://schemas.microsoft.com/office/word/2015/wordml/symex" xmlns:wpg="http://schemas.microsoft.com/office/word/2010/wordprocessingGroup" xmlns:wpi="http://schemas.microsoft.com/office/word/2010/wordprocessingInk" xmlns:wne="http://schemas.microsoft.com/office/word/2006/wordml" xmlns:wps="http://schemas.microsoft.com/office/word/2010/wordprocessingShape" mc:Ignorable="w14 w15 w16se w16cid w16 w16cex w16sdtdh w16du wp14">
+<w:endnotes xmlns:wpc="http://schemas.microsoft.com/office/word/2010/wordprocessingCanvas" xmlns:cx="http://schemas.microsoft.com/office/drawing/2014/chartex" xmlns:cx1="http://schemas.microsoft.com/office/drawing/2015/9/8/chartex" xmlns:cx2="http://schemas.microsoft.com/office/drawing/2015/10/21/chartex" xmlns:cx3="http://schemas.microsoft.com/office/drawing/2016/5/9/chartex" xmlns:cx4="http://schemas.microsoft.com/office/drawing/2016/5/10/chartex" xmlns:cx5="http://schemas.microsoft.com/office/drawing/2016/5/11/chartex" xmlns:cx6="http://schemas.microsoft.com/office/drawing/2016/5/12/chartex" xmlns:cx7="http://schemas.microsoft.com/office/drawing/2016/5/13/chartex" xmlns:cx8="http://schemas.microsoft.com/office/drawing/2016/5/14/chartex" xmlns:mc="http://schemas.openxmlformats.org/markup-compatibility/2006" xmlns:aink="http://schemas.microsoft.com/office/drawing/2016/ink" xmlns:am3d="http://schemas.microsoft.com/office/drawing/2017/model3d" xmlns:o="urn:schemas-microsoft-com:office:office" xmlns:oel="http://schemas.microsoft.com/office/2019/extlst" xmlns:r="http://schemas.openxmlformats.org/officeDocument/2006/relationships" xmlns:m="http://schemas.openxmlformats.org/officeDocument/2006/math" xmlns:v="urn:schemas-microsoft-com:vml" xmlns:wp14="http://schemas.microsoft.com/office/word/2010/wordprocessingDrawing" xmlns:wp="http://schemas.openxmlformats.org/drawingml/2006/wordprocessingDrawing" xmlns:w10="urn:schemas-microsoft-com:office:word" xmlns:w="http://schemas.openxmlformats.org/wordprocessingml/2006/main" xmlns:w14="http://schemas.microsoft.com/office/word/2010/wordml" xmlns:w15="http://schemas.microsoft.com/office/word/2012/wordml" xmlns:w16cex="http://schemas.microsoft.com/office/word/2018/wordml/cex" xmlns:w16cid="http://schemas.microsoft.com/office/word/2016/wordml/cid" xmlns:w16="http://schemas.microsoft.com/office/word/2018/wordml" xmlns:w16du="http://schemas.microsoft.com/office/word/2023/wordml/word16du" xmlns:w16sdtdh="http://schemas.microsoft.com/office/word/2020/wordml/sdtdatahash" xmlns:w16sdtfl="http://schemas.microsoft.com/office/word/2024/wordml/sdtformatlock" xmlns:w16se="http://schemas.microsoft.com/office/word/2015/wordml/symex" xmlns:wpg="http://schemas.microsoft.com/office/word/2010/wordprocessingGroup" xmlns:wpi="http://schemas.microsoft.com/office/word/2010/wordprocessingInk" xmlns:wne="http://schemas.microsoft.com/office/word/2006/wordml" xmlns:wps="http://schemas.microsoft.com/office/word/2010/wordprocessingShape" mc:Ignorable="w14 w15 w16se w16cid w16 w16cex w16sdtdh w16sdtfl w16du wp14">
   <w:endnote w:type="separator" w:id="-1">
     <w:p>
       <w:r>
@@ -5675,7 +4071,7 @@
 </file>
 
 <file path=word/footer1.xml><?xml version="1.0" encoding="utf-8"?>
-<w:ftr xmlns:wpc="http://schemas.microsoft.com/office/word/2010/wordprocessingCanvas" xmlns:cx="http://schemas.microsoft.com/office/drawing/2014/chartex" xmlns:cx1="http://schemas.microsoft.com/office/drawing/2015/9/8/chartex" xmlns:cx2="http://schemas.microsoft.com/office/drawing/2015/10/21/chartex" xmlns:cx3="http://schemas.microsoft.com/office/drawing/2016/5/9/chartex" xmlns:cx4="http://schemas.microsoft.com/office/drawing/2016/5/10/chartex" xmlns:cx5="http://schemas.microsoft.com/office/drawing/2016/5/11/chartex" xmlns:cx6="http://schemas.microsoft.com/office/drawing/2016/5/12/chartex" xmlns:cx7="http://schemas.microsoft.com/office/drawing/2016/5/13/chartex" xmlns:cx8="http://schemas.microsoft.com/office/drawing/2016/5/14/chartex" xmlns:mc="http://schemas.openxmlformats.org/markup-compatibility/2006" xmlns:aink="http://schemas.microsoft.com/office/drawing/2016/ink" xmlns:am3d="http://schemas.microsoft.com/office/drawing/2017/model3d" xmlns:o="urn:schemas-microsoft-com:office:office" xmlns:oel="http://schemas.microsoft.com/office/2019/extlst" xmlns:r="http://schemas.openxmlformats.org/officeDocument/2006/relationships" xmlns:m="http://schemas.openxmlformats.org/officeDocument/2006/math" xmlns:v="urn:schemas-microsoft-com:vml" xmlns:wp14="http://schemas.microsoft.com/office/word/2010/wordprocessingDrawing" xmlns:wp="http://schemas.openxmlformats.org/drawingml/2006/wordprocessingDrawing" xmlns:w10="urn:schemas-microsoft-com:office:word" xmlns:w="http://schemas.openxmlformats.org/wordprocessingml/2006/main" xmlns:w14="http://schemas.microsoft.com/office/word/2010/wordml" xmlns:w15="http://schemas.microsoft.com/office/word/2012/wordml" xmlns:w16cex="http://schemas.microsoft.com/office/word/2018/wordml/cex" xmlns:w16cid="http://schemas.microsoft.com/office/word/2016/wordml/cid" xmlns:w16="http://schemas.microsoft.com/office/word/2018/wordml" xmlns:w16du="http://schemas.microsoft.com/office/word/2023/wordml/word16du" xmlns:w16sdtdh="http://schemas.microsoft.com/office/word/2020/wordml/sdtdatahash" xmlns:w16se="http://schemas.microsoft.com/office/word/2015/wordml/symex" xmlns:wpg="http://schemas.microsoft.com/office/word/2010/wordprocessingGroup" xmlns:wpi="http://schemas.microsoft.com/office/word/2010/wordprocessingInk" xmlns:wne="http://schemas.microsoft.com/office/word/2006/wordml" xmlns:wps="http://schemas.microsoft.com/office/word/2010/wordprocessingShape" mc:Ignorable="w14 w15 w16se w16cid w16 w16cex w16sdtdh w16du wp14">
+<w:ftr xmlns:wpc="http://schemas.microsoft.com/office/word/2010/wordprocessingCanvas" xmlns:cx="http://schemas.microsoft.com/office/drawing/2014/chartex" xmlns:cx1="http://schemas.microsoft.com/office/drawing/2015/9/8/chartex" xmlns:cx2="http://schemas.microsoft.com/office/drawing/2015/10/21/chartex" xmlns:cx3="http://schemas.microsoft.com/office/drawing/2016/5/9/chartex" xmlns:cx4="http://schemas.microsoft.com/office/drawing/2016/5/10/chartex" xmlns:cx5="http://schemas.microsoft.com/office/drawing/2016/5/11/chartex" xmlns:cx6="http://schemas.microsoft.com/office/drawing/2016/5/12/chartex" xmlns:cx7="http://schemas.microsoft.com/office/drawing/2016/5/13/chartex" xmlns:cx8="http://schemas.microsoft.com/office/drawing/2016/5/14/chartex" xmlns:mc="http://schemas.openxmlformats.org/markup-compatibility/2006" xmlns:aink="http://schemas.microsoft.com/office/drawing/2016/ink" xmlns:am3d="http://schemas.microsoft.com/office/drawing/2017/model3d" xmlns:o="urn:schemas-microsoft-com:office:office" xmlns:oel="http://schemas.microsoft.com/office/2019/extlst" xmlns:r="http://schemas.openxmlformats.org/officeDocument/2006/relationships" xmlns:m="http://schemas.openxmlformats.org/officeDocument/2006/math" xmlns:v="urn:schemas-microsoft-com:vml" xmlns:wp14="http://schemas.microsoft.com/office/word/2010/wordprocessingDrawing" xmlns:wp="http://schemas.openxmlformats.org/drawingml/2006/wordprocessingDrawing" xmlns:w10="urn:schemas-microsoft-com:office:word" xmlns:w="http://schemas.openxmlformats.org/wordprocessingml/2006/main" xmlns:w14="http://schemas.microsoft.com/office/word/2010/wordml" xmlns:w15="http://schemas.microsoft.com/office/word/2012/wordml" xmlns:w16cex="http://schemas.microsoft.com/office/word/2018/wordml/cex" xmlns:w16cid="http://schemas.microsoft.com/office/word/2016/wordml/cid" xmlns:w16="http://schemas.microsoft.com/office/word/2018/wordml" xmlns:w16du="http://schemas.microsoft.com/office/word/2023/wordml/word16du" xmlns:w16sdtdh="http://schemas.microsoft.com/office/word/2020/wordml/sdtdatahash" xmlns:w16sdtfl="http://schemas.microsoft.com/office/word/2024/wordml/sdtformatlock" xmlns:w16se="http://schemas.microsoft.com/office/word/2015/wordml/symex" xmlns:wpg="http://schemas.microsoft.com/office/word/2010/wordprocessingGroup" xmlns:wpi="http://schemas.microsoft.com/office/word/2010/wordprocessingInk" xmlns:wne="http://schemas.microsoft.com/office/word/2006/wordml" xmlns:wps="http://schemas.microsoft.com/office/word/2010/wordprocessingShape" mc:Ignorable="w14 w15 w16se w16cid w16 w16cex w16sdtdh w16sdtfl w16du wp14">
   <w:tbl>
     <w:tblPr>
       <w:tblW w:w="0" w:type="auto"/>
@@ -5779,7 +4175,7 @@
               <w:noProof/>
               <w:lang w:val="hr-HR"/>
             </w:rPr>
-            <w:t>2024</w:t>
+            <w:t>2025</w:t>
           </w:r>
           <w:r>
             <w:rPr>
@@ -5904,7 +4300,7 @@
 </file>
 
 <file path=word/footnotes.xml><?xml version="1.0" encoding="utf-8"?>
-<w:footnotes xmlns:wpc="http://schemas.microsoft.com/office/word/2010/wordprocessingCanvas" xmlns:cx="http://schemas.microsoft.com/office/drawing/2014/chartex" xmlns:cx1="http://schemas.microsoft.com/office/drawing/2015/9/8/chartex" xmlns:cx2="http://schemas.microsoft.com/office/drawing/2015/10/21/chartex" xmlns:cx3="http://schemas.microsoft.com/office/drawing/2016/5/9/chartex" xmlns:cx4="http://schemas.microsoft.com/office/drawing/2016/5/10/chartex" xmlns:cx5="http://schemas.microsoft.com/office/drawing/2016/5/11/chartex" xmlns:cx6="http://schemas.microsoft.com/office/drawing/2016/5/12/chartex" xmlns:cx7="http://schemas.microsoft.com/office/drawing/2016/5/13/chartex" xmlns:cx8="http://schemas.microsoft.com/office/drawing/2016/5/14/chartex" xmlns:mc="http://schemas.openxmlformats.org/markup-compatibility/2006" xmlns:aink="http://schemas.microsoft.com/office/drawing/2016/ink" xmlns:am3d="http://schemas.microsoft.com/office/drawing/2017/model3d" xmlns:o="urn:schemas-microsoft-com:office:office" xmlns:oel="http://schemas.microsoft.com/office/2019/extlst" xmlns:r="http://schemas.openxmlformats.org/officeDocument/2006/relationships" xmlns:m="http://schemas.openxmlformats.org/officeDocument/2006/math" xmlns:v="urn:schemas-microsoft-com:vml" xmlns:wp14="http://schemas.microsoft.com/office/word/2010/wordprocessingDrawing" xmlns:wp="http://schemas.openxmlformats.org/drawingml/2006/wordprocessingDrawing" xmlns:w10="urn:schemas-microsoft-com:office:word" xmlns:w="http://schemas.openxmlformats.org/wordprocessingml/2006/main" xmlns:w14="http://schemas.microsoft.com/office/word/2010/wordml" xmlns:w15="http://schemas.microsoft.com/office/word/2012/wordml" xmlns:w16cex="http://schemas.microsoft.com/office/word/2018/wordml/cex" xmlns:w16cid="http://schemas.microsoft.com/office/word/2016/wordml/cid" xmlns:w16="http://schemas.microsoft.com/office/word/2018/wordml" xmlns:w16du="http://schemas.microsoft.com/office/word/2023/wordml/word16du" xmlns:w16sdtdh="http://schemas.microsoft.com/office/word/2020/wordml/sdtdatahash" xmlns:w16se="http://schemas.microsoft.com/office/word/2015/wordml/symex" xmlns:wpg="http://schemas.microsoft.com/office/word/2010/wordprocessingGroup" xmlns:wpi="http://schemas.microsoft.com/office/word/2010/wordprocessingInk" xmlns:wne="http://schemas.microsoft.com/office/word/2006/wordml" xmlns:wps="http://schemas.microsoft.com/office/word/2010/wordprocessingShape" mc:Ignorable="w14 w15 w16se w16cid w16 w16cex w16sdtdh w16du wp14">
+<w:footnotes xmlns:wpc="http://schemas.microsoft.com/office/word/2010/wordprocessingCanvas" xmlns:cx="http://schemas.microsoft.com/office/drawing/2014/chartex" xmlns:cx1="http://schemas.microsoft.com/office/drawing/2015/9/8/chartex" xmlns:cx2="http://schemas.microsoft.com/office/drawing/2015/10/21/chartex" xmlns:cx3="http://schemas.microsoft.com/office/drawing/2016/5/9/chartex" xmlns:cx4="http://schemas.microsoft.com/office/drawing/2016/5/10/chartex" xmlns:cx5="http://schemas.microsoft.com/office/drawing/2016/5/11/chartex" xmlns:cx6="http://schemas.microsoft.com/office/drawing/2016/5/12/chartex" xmlns:cx7="http://schemas.microsoft.com/office/drawing/2016/5/13/chartex" xmlns:cx8="http://schemas.microsoft.com/office/drawing/2016/5/14/chartex" xmlns:mc="http://schemas.openxmlformats.org/markup-compatibility/2006" xmlns:aink="http://schemas.microsoft.com/office/drawing/2016/ink" xmlns:am3d="http://schemas.microsoft.com/office/drawing/2017/model3d" xmlns:o="urn:schemas-microsoft-com:office:office" xmlns:oel="http://schemas.microsoft.com/office/2019/extlst" xmlns:r="http://schemas.openxmlformats.org/officeDocument/2006/relationships" xmlns:m="http://schemas.openxmlformats.org/officeDocument/2006/math" xmlns:v="urn:schemas-microsoft-com:vml" xmlns:wp14="http://schemas.microsoft.com/office/word/2010/wordprocessingDrawing" xmlns:wp="http://schemas.openxmlformats.org/drawingml/2006/wordprocessingDrawing" xmlns:w10="urn:schemas-microsoft-com:office:word" xmlns:w="http://schemas.openxmlformats.org/wordprocessingml/2006/main" xmlns:w14="http://schemas.microsoft.com/office/word/2010/wordml" xmlns:w15="http://schemas.microsoft.com/office/word/2012/wordml" xmlns:w16cex="http://schemas.microsoft.com/office/word/2018/wordml/cex" xmlns:w16cid="http://schemas.microsoft.com/office/word/2016/wordml/cid" xmlns:w16="http://schemas.microsoft.com/office/word/2018/wordml" xmlns:w16du="http://schemas.microsoft.com/office/word/2023/wordml/word16du" xmlns:w16sdtdh="http://schemas.microsoft.com/office/word/2020/wordml/sdtdatahash" xmlns:w16sdtfl="http://schemas.microsoft.com/office/word/2024/wordml/sdtformatlock" xmlns:w16se="http://schemas.microsoft.com/office/word/2015/wordml/symex" xmlns:wpg="http://schemas.microsoft.com/office/word/2010/wordprocessingGroup" xmlns:wpi="http://schemas.microsoft.com/office/word/2010/wordprocessingInk" xmlns:wne="http://schemas.microsoft.com/office/word/2006/wordml" xmlns:wps="http://schemas.microsoft.com/office/word/2010/wordprocessingShape" mc:Ignorable="w14 w15 w16se w16cid w16 w16cex w16sdtdh w16sdtfl w16du wp14">
   <w:footnote w:type="separator" w:id="-1">
     <w:p>
       <w:r>
@@ -5923,7 +4319,7 @@
 </file>
 
 <file path=word/header1.xml><?xml version="1.0" encoding="utf-8"?>
-<w:hdr xmlns:wpc="http://schemas.microsoft.com/office/word/2010/wordprocessingCanvas" xmlns:cx="http://schemas.microsoft.com/office/drawing/2014/chartex" xmlns:cx1="http://schemas.microsoft.com/office/drawing/2015/9/8/chartex" xmlns:cx2="http://schemas.microsoft.com/office/drawing/2015/10/21/chartex" xmlns:cx3="http://schemas.microsoft.com/office/drawing/2016/5/9/chartex" xmlns:cx4="http://schemas.microsoft.com/office/drawing/2016/5/10/chartex" xmlns:cx5="http://schemas.microsoft.com/office/drawing/2016/5/11/chartex" xmlns:cx6="http://schemas.microsoft.com/office/drawing/2016/5/12/chartex" xmlns:cx7="http://schemas.microsoft.com/office/drawing/2016/5/13/chartex" xmlns:cx8="http://schemas.microsoft.com/office/drawing/2016/5/14/chartex" xmlns:mc="http://schemas.openxmlformats.org/markup-compatibility/2006" xmlns:aink="http://schemas.microsoft.com/office/drawing/2016/ink" xmlns:am3d="http://schemas.microsoft.com/office/drawing/2017/model3d" xmlns:o="urn:schemas-microsoft-com:office:office" xmlns:oel="http://schemas.microsoft.com/office/2019/extlst" xmlns:r="http://schemas.openxmlformats.org/officeDocument/2006/relationships" xmlns:m="http://schemas.openxmlformats.org/officeDocument/2006/math" xmlns:v="urn:schemas-microsoft-com:vml" xmlns:wp14="http://schemas.microsoft.com/office/word/2010/wordprocessingDrawing" xmlns:wp="http://schemas.openxmlformats.org/drawingml/2006/wordprocessingDrawing" xmlns:w10="urn:schemas-microsoft-com:office:word" xmlns:w="http://schemas.openxmlformats.org/wordprocessingml/2006/main" xmlns:w14="http://schemas.microsoft.com/office/word/2010/wordml" xmlns:w15="http://schemas.microsoft.com/office/word/2012/wordml" xmlns:w16cex="http://schemas.microsoft.com/office/word/2018/wordml/cex" xmlns:w16cid="http://schemas.microsoft.com/office/word/2016/wordml/cid" xmlns:w16="http://schemas.microsoft.com/office/word/2018/wordml" xmlns:w16du="http://schemas.microsoft.com/office/word/2023/wordml/word16du" xmlns:w16sdtdh="http://schemas.microsoft.com/office/word/2020/wordml/sdtdatahash" xmlns:w16se="http://schemas.microsoft.com/office/word/2015/wordml/symex" xmlns:wpg="http://schemas.microsoft.com/office/word/2010/wordprocessingGroup" xmlns:wpi="http://schemas.microsoft.com/office/word/2010/wordprocessingInk" xmlns:wne="http://schemas.microsoft.com/office/word/2006/wordml" xmlns:wps="http://schemas.microsoft.com/office/word/2010/wordprocessingShape" mc:Ignorable="w14 w15 w16se w16cid w16 w16cex w16sdtdh w16du wp14">
+<w:hdr xmlns:wpc="http://schemas.microsoft.com/office/word/2010/wordprocessingCanvas" xmlns:cx="http://schemas.microsoft.com/office/drawing/2014/chartex" xmlns:cx1="http://schemas.microsoft.com/office/drawing/2015/9/8/chartex" xmlns:cx2="http://schemas.microsoft.com/office/drawing/2015/10/21/chartex" xmlns:cx3="http://schemas.microsoft.com/office/drawing/2016/5/9/chartex" xmlns:cx4="http://schemas.microsoft.com/office/drawing/2016/5/10/chartex" xmlns:cx5="http://schemas.microsoft.com/office/drawing/2016/5/11/chartex" xmlns:cx6="http://schemas.microsoft.com/office/drawing/2016/5/12/chartex" xmlns:cx7="http://schemas.microsoft.com/office/drawing/2016/5/13/chartex" xmlns:cx8="http://schemas.microsoft.com/office/drawing/2016/5/14/chartex" xmlns:mc="http://schemas.openxmlformats.org/markup-compatibility/2006" xmlns:aink="http://schemas.microsoft.com/office/drawing/2016/ink" xmlns:am3d="http://schemas.microsoft.com/office/drawing/2017/model3d" xmlns:o="urn:schemas-microsoft-com:office:office" xmlns:oel="http://schemas.microsoft.com/office/2019/extlst" xmlns:r="http://schemas.openxmlformats.org/officeDocument/2006/relationships" xmlns:m="http://schemas.openxmlformats.org/officeDocument/2006/math" xmlns:v="urn:schemas-microsoft-com:vml" xmlns:wp14="http://schemas.microsoft.com/office/word/2010/wordprocessingDrawing" xmlns:wp="http://schemas.openxmlformats.org/drawingml/2006/wordprocessingDrawing" xmlns:w10="urn:schemas-microsoft-com:office:word" xmlns:w="http://schemas.openxmlformats.org/wordprocessingml/2006/main" xmlns:w14="http://schemas.microsoft.com/office/word/2010/wordml" xmlns:w15="http://schemas.microsoft.com/office/word/2012/wordml" xmlns:w16cex="http://schemas.microsoft.com/office/word/2018/wordml/cex" xmlns:w16cid="http://schemas.microsoft.com/office/word/2016/wordml/cid" xmlns:w16="http://schemas.microsoft.com/office/word/2018/wordml" xmlns:w16du="http://schemas.microsoft.com/office/word/2023/wordml/word16du" xmlns:w16sdtdh="http://schemas.microsoft.com/office/word/2020/wordml/sdtdatahash" xmlns:w16sdtfl="http://schemas.microsoft.com/office/word/2024/wordml/sdtformatlock" xmlns:w16se="http://schemas.microsoft.com/office/word/2015/wordml/symex" xmlns:wpg="http://schemas.microsoft.com/office/word/2010/wordprocessingGroup" xmlns:wpi="http://schemas.microsoft.com/office/word/2010/wordprocessingInk" xmlns:wne="http://schemas.microsoft.com/office/word/2006/wordml" xmlns:wps="http://schemas.microsoft.com/office/word/2010/wordprocessingShape" mc:Ignorable="w14 w15 w16se w16cid w16 w16cex w16sdtdh w16sdtfl w16du wp14">
   <w:tbl>
     <w:tblPr>
       <w:tblW w:w="0" w:type="auto"/>
@@ -5992,7 +4388,7 @@
             <w:rPr>
               <w:lang w:val="hr-HR"/>
             </w:rPr>
-            <w:t>1</w:t>
+            <w:t>2</w:t>
           </w:r>
           <w:r>
             <w:rPr>
@@ -6042,7 +4438,7 @@
             <w:rPr>
               <w:lang w:val="hr-HR"/>
             </w:rPr>
-            <w:t>06</w:t>
+            <w:t>26</w:t>
           </w:r>
           <w:r>
             <w:rPr>
@@ -6054,7 +4450,13 @@
             <w:rPr>
               <w:lang w:val="hr-HR"/>
             </w:rPr>
-            <w:t>11</w:t>
+            <w:t>0</w:t>
+          </w:r>
+          <w:r>
+            <w:rPr>
+              <w:lang w:val="hr-HR"/>
+            </w:rPr>
+            <w:t>1</w:t>
           </w:r>
           <w:r>
             <w:rPr>
@@ -6081,7 +4483,7 @@
 </file>
 
 <file path=word/numbering.xml><?xml version="1.0" encoding="utf-8"?>
-<w:numbering xmlns:wpc="http://schemas.microsoft.com/office/word/2010/wordprocessingCanvas" xmlns:cx="http://schemas.microsoft.com/office/drawing/2014/chartex" xmlns:cx1="http://schemas.microsoft.com/office/drawing/2015/9/8/chartex" xmlns:cx2="http://schemas.microsoft.com/office/drawing/2015/10/21/chartex" xmlns:cx3="http://schemas.microsoft.com/office/drawing/2016/5/9/chartex" xmlns:cx4="http://schemas.microsoft.com/office/drawing/2016/5/10/chartex" xmlns:cx5="http://schemas.microsoft.com/office/drawing/2016/5/11/chartex" xmlns:cx6="http://schemas.microsoft.com/office/drawing/2016/5/12/chartex" xmlns:cx7="http://schemas.microsoft.com/office/drawing/2016/5/13/chartex" xmlns:cx8="http://schemas.microsoft.com/office/drawing/2016/5/14/chartex" xmlns:mc="http://schemas.openxmlformats.org/markup-compatibility/2006" xmlns:aink="http://schemas.microsoft.com/office/drawing/2016/ink" xmlns:am3d="http://schemas.microsoft.com/office/drawing/2017/model3d" xmlns:o="urn:schemas-microsoft-com:office:office" xmlns:oel="http://schemas.microsoft.com/office/2019/extlst" xmlns:r="http://schemas.openxmlformats.org/officeDocument/2006/relationships" xmlns:m="http://schemas.openxmlformats.org/officeDocument/2006/math" xmlns:v="urn:schemas-microsoft-com:vml" xmlns:wp14="http://schemas.microsoft.com/office/word/2010/wordprocessingDrawing" xmlns:wp="http://schemas.openxmlformats.org/drawingml/2006/wordprocessingDrawing" xmlns:w10="urn:schemas-microsoft-com:office:word" xmlns:w="http://schemas.openxmlformats.org/wordprocessingml/2006/main" xmlns:w14="http://schemas.microsoft.com/office/word/2010/wordml" xmlns:w15="http://schemas.microsoft.com/office/word/2012/wordml" xmlns:w16cex="http://schemas.microsoft.com/office/word/2018/wordml/cex" xmlns:w16cid="http://schemas.microsoft.com/office/word/2016/wordml/cid" xmlns:w16="http://schemas.microsoft.com/office/word/2018/wordml" xmlns:w16du="http://schemas.microsoft.com/office/word/2023/wordml/word16du" xmlns:w16sdtdh="http://schemas.microsoft.com/office/word/2020/wordml/sdtdatahash" xmlns:w16se="http://schemas.microsoft.com/office/word/2015/wordml/symex" xmlns:wpg="http://schemas.microsoft.com/office/word/2010/wordprocessingGroup" xmlns:wpi="http://schemas.microsoft.com/office/word/2010/wordprocessingInk" xmlns:wne="http://schemas.microsoft.com/office/word/2006/wordml" xmlns:wps="http://schemas.microsoft.com/office/word/2010/wordprocessingShape" mc:Ignorable="w14 w15 w16se w16cid w16 w16cex w16sdtdh w16du wp14">
+<w:numbering xmlns:wpc="http://schemas.microsoft.com/office/word/2010/wordprocessingCanvas" xmlns:cx="http://schemas.microsoft.com/office/drawing/2014/chartex" xmlns:cx1="http://schemas.microsoft.com/office/drawing/2015/9/8/chartex" xmlns:cx2="http://schemas.microsoft.com/office/drawing/2015/10/21/chartex" xmlns:cx3="http://schemas.microsoft.com/office/drawing/2016/5/9/chartex" xmlns:cx4="http://schemas.microsoft.com/office/drawing/2016/5/10/chartex" xmlns:cx5="http://schemas.microsoft.com/office/drawing/2016/5/11/chartex" xmlns:cx6="http://schemas.microsoft.com/office/drawing/2016/5/12/chartex" xmlns:cx7="http://schemas.microsoft.com/office/drawing/2016/5/13/chartex" xmlns:cx8="http://schemas.microsoft.com/office/drawing/2016/5/14/chartex" xmlns:mc="http://schemas.openxmlformats.org/markup-compatibility/2006" xmlns:aink="http://schemas.microsoft.com/office/drawing/2016/ink" xmlns:am3d="http://schemas.microsoft.com/office/drawing/2017/model3d" xmlns:o="urn:schemas-microsoft-com:office:office" xmlns:oel="http://schemas.microsoft.com/office/2019/extlst" xmlns:r="http://schemas.openxmlformats.org/officeDocument/2006/relationships" xmlns:m="http://schemas.openxmlformats.org/officeDocument/2006/math" xmlns:v="urn:schemas-microsoft-com:vml" xmlns:wp14="http://schemas.microsoft.com/office/word/2010/wordprocessingDrawing" xmlns:wp="http://schemas.openxmlformats.org/drawingml/2006/wordprocessingDrawing" xmlns:w10="urn:schemas-microsoft-com:office:word" xmlns:w="http://schemas.openxmlformats.org/wordprocessingml/2006/main" xmlns:w14="http://schemas.microsoft.com/office/word/2010/wordml" xmlns:w15="http://schemas.microsoft.com/office/word/2012/wordml" xmlns:w16cex="http://schemas.microsoft.com/office/word/2018/wordml/cex" xmlns:w16cid="http://schemas.microsoft.com/office/word/2016/wordml/cid" xmlns:w16="http://schemas.microsoft.com/office/word/2018/wordml" xmlns:w16du="http://schemas.microsoft.com/office/word/2023/wordml/word16du" xmlns:w16sdtdh="http://schemas.microsoft.com/office/word/2020/wordml/sdtdatahash" xmlns:w16sdtfl="http://schemas.microsoft.com/office/word/2024/wordml/sdtformatlock" xmlns:w16se="http://schemas.microsoft.com/office/word/2015/wordml/symex" xmlns:wpg="http://schemas.microsoft.com/office/word/2010/wordprocessingGroup" xmlns:wpi="http://schemas.microsoft.com/office/word/2010/wordprocessingInk" xmlns:wne="http://schemas.microsoft.com/office/word/2006/wordml" xmlns:wps="http://schemas.microsoft.com/office/word/2010/wordprocessingShape" mc:Ignorable="w14 w15 w16se w16cid w16 w16cex w16sdtdh w16sdtfl w16du wp14">
   <w:abstractNum w:abstractNumId="0" w15:restartNumberingAfterBreak="0">
     <w:nsid w:val="FFFFFFFB"/>
     <w:multiLevelType w:val="multilevel"/>
@@ -7181,7 +5583,7 @@
 </file>
 
 <file path=word/styles.xml><?xml version="1.0" encoding="utf-8"?>
-<w:styles xmlns:mc="http://schemas.openxmlformats.org/markup-compatibility/2006" xmlns:r="http://schemas.openxmlformats.org/officeDocument/2006/relationships" xmlns:w="http://schemas.openxmlformats.org/wordprocessingml/2006/main" xmlns:w14="http://schemas.microsoft.com/office/word/2010/wordml" xmlns:w15="http://schemas.microsoft.com/office/word/2012/wordml" xmlns:w16cex="http://schemas.microsoft.com/office/word/2018/wordml/cex" xmlns:w16cid="http://schemas.microsoft.com/office/word/2016/wordml/cid" xmlns:w16="http://schemas.microsoft.com/office/word/2018/wordml" xmlns:w16du="http://schemas.microsoft.com/office/word/2023/wordml/word16du" xmlns:w16sdtdh="http://schemas.microsoft.com/office/word/2020/wordml/sdtdatahash" xmlns:w16se="http://schemas.microsoft.com/office/word/2015/wordml/symex" mc:Ignorable="w14 w15 w16se w16cid w16 w16cex w16sdtdh w16du">
+<w:styles xmlns:mc="http://schemas.openxmlformats.org/markup-compatibility/2006" xmlns:r="http://schemas.openxmlformats.org/officeDocument/2006/relationships" xmlns:w="http://schemas.openxmlformats.org/wordprocessingml/2006/main" xmlns:w14="http://schemas.microsoft.com/office/word/2010/wordml" xmlns:w15="http://schemas.microsoft.com/office/word/2012/wordml" xmlns:w16cex="http://schemas.microsoft.com/office/word/2018/wordml/cex" xmlns:w16cid="http://schemas.microsoft.com/office/word/2016/wordml/cid" xmlns:w16="http://schemas.microsoft.com/office/word/2018/wordml" xmlns:w16du="http://schemas.microsoft.com/office/word/2023/wordml/word16du" xmlns:w16sdtdh="http://schemas.microsoft.com/office/word/2020/wordml/sdtdatahash" xmlns:w16sdtfl="http://schemas.microsoft.com/office/word/2024/wordml/sdtformatlock" xmlns:w16se="http://schemas.microsoft.com/office/word/2015/wordml/symex" mc:Ignorable="w14 w15 w16se w16cid w16 w16cex w16sdtdh w16sdtfl w16du">
   <w:docDefaults>
     <w:rPrDefault>
       <w:rPr>
@@ -7644,7 +6046,6 @@
   <w:style w:type="character" w:default="1" w:styleId="Zadanifontodlomka">
     <w:name w:val="Default Paragraph Font"/>
     <w:uiPriority w:val="1"/>
-    <w:semiHidden/>
     <w:unhideWhenUsed/>
   </w:style>
   <w:style w:type="table" w:default="1" w:styleId="Obinatablica">
@@ -8009,7 +6410,7 @@
     <w:basedOn w:val="Normal"/>
     <w:next w:val="Tijeloteksta"/>
     <w:autoRedefine/>
-    <w:rsid w:val="006D00C5"/>
+    <w:rsid w:val="00385984"/>
     <w:rPr>
       <w:i/>
       <w:color w:val="0000FF"/>

</xml_diff>